<commit_message>
modify fonts in reverse_facts, add length/time/speed calculation
</commit_message>
<xml_diff>
--- a/reverse_facts.docx
+++ b/reverse_facts.docx
@@ -6,8 +6,18 @@
       <w:pPr>
         <w:pStyle w:val="Heading1"/>
         <w:ind w:left="90" w:hanging="90"/>
+        <w:rPr>
+          <w:rFonts w:ascii="Fette National Fraktur" w:hAnsi="Fette National Fraktur"/>
+          <w:color w:val="964C24" w:themeColor="accent3" w:themeShade="BF"/>
+          <w:u w:val="double"/>
+        </w:rPr>
       </w:pPr>
       <w:r>
+        <w:rPr>
+          <w:rFonts w:ascii="Fette National Fraktur" w:hAnsi="Fette National Fraktur"/>
+          <w:color w:val="964C24" w:themeColor="accent3" w:themeShade="BF"/>
+          <w:u w:val="double"/>
+        </w:rPr>
         <w:t>Common Ship Dimensions:</w:t>
       </w:r>
     </w:p>
@@ -24,8 +34,16 @@
     <w:p>
       <w:pPr>
         <w:pStyle w:val="Heading2"/>
+        <w:rPr>
+          <w:rFonts w:ascii="Fette National Fraktur" w:hAnsi="Fette National Fraktur"/>
+          <w:color w:val="964C24" w:themeColor="accent3" w:themeShade="BF"/>
+        </w:rPr>
       </w:pPr>
       <w:r>
+        <w:rPr>
+          <w:rFonts w:ascii="Fette National Fraktur" w:hAnsi="Fette National Fraktur"/>
+          <w:color w:val="964C24" w:themeColor="accent3" w:themeShade="BF"/>
+        </w:rPr>
         <w:t>Freighters</w:t>
       </w:r>
     </w:p>
@@ -33,6 +51,14 @@
       <w:tblPr>
         <w:tblStyle w:val="TableGrid"/>
         <w:tblW w:w="4855" w:type="dxa"/>
+        <w:tblBorders>
+          <w:top w:val="none" w:sz="0" w:space="0" w:color="auto"/>
+          <w:left w:val="none" w:sz="0" w:space="0" w:color="auto"/>
+          <w:bottom w:val="none" w:sz="0" w:space="0" w:color="auto"/>
+          <w:right w:val="none" w:sz="0" w:space="0" w:color="auto"/>
+          <w:insideH w:val="none" w:sz="0" w:space="0" w:color="auto"/>
+          <w:insideV w:val="none" w:sz="0" w:space="0" w:color="auto"/>
+        </w:tblBorders>
         <w:tblLayout w:type="fixed"/>
         <w:tblLook w:val="04A0" w:firstRow="1" w:lastRow="0" w:firstColumn="1" w:lastColumn="0" w:noHBand="0" w:noVBand="1"/>
       </w:tblPr>
@@ -49,13 +75,19 @@
         <w:tc>
           <w:tcPr>
             <w:tcW w:w="1885" w:type="dxa"/>
-            <w:vAlign w:val="center"/>
-          </w:tcPr>
-          <w:p>
-            <w:pPr>
-              <w:ind w:left="90" w:hanging="90"/>
-              <w:jc w:val="center"/>
-              <w:rPr>
+            <w:tcBorders>
+              <w:top w:val="single" w:sz="4" w:space="0" w:color="auto"/>
+              <w:bottom w:val="double" w:sz="4" w:space="0" w:color="auto"/>
+              <w:right w:val="single" w:sz="4" w:space="0" w:color="auto"/>
+            </w:tcBorders>
+            <w:vAlign w:val="center"/>
+          </w:tcPr>
+          <w:p>
+            <w:pPr>
+              <w:ind w:left="90" w:hanging="90"/>
+              <w:jc w:val="center"/>
+              <w:rPr>
+                <w:rFonts w:ascii="Century" w:hAnsi="Century"/>
                 <w:b/>
                 <w:bCs/>
                 <w:sz w:val="21"/>
@@ -64,6 +96,7 @@
             </w:pPr>
             <w:r>
               <w:rPr>
+                <w:rFonts w:ascii="Century" w:hAnsi="Century"/>
                 <w:b/>
                 <w:bCs/>
                 <w:sz w:val="21"/>
@@ -73,6 +106,7 @@
             </w:r>
             <w:r>
               <w:rPr>
+                <w:rFonts w:ascii="Century" w:hAnsi="Century"/>
                 <w:b/>
                 <w:bCs/>
                 <w:sz w:val="21"/>
@@ -85,13 +119,20 @@
         <w:tc>
           <w:tcPr>
             <w:tcW w:w="900" w:type="dxa"/>
-            <w:vAlign w:val="center"/>
-          </w:tcPr>
-          <w:p>
-            <w:pPr>
-              <w:ind w:left="90" w:hanging="90"/>
-              <w:jc w:val="center"/>
-              <w:rPr>
+            <w:tcBorders>
+              <w:top w:val="single" w:sz="4" w:space="0" w:color="auto"/>
+              <w:left w:val="single" w:sz="4" w:space="0" w:color="auto"/>
+              <w:bottom w:val="double" w:sz="4" w:space="0" w:color="auto"/>
+              <w:right w:val="single" w:sz="4" w:space="0" w:color="auto"/>
+            </w:tcBorders>
+            <w:vAlign w:val="center"/>
+          </w:tcPr>
+          <w:p>
+            <w:pPr>
+              <w:ind w:left="90" w:hanging="90"/>
+              <w:jc w:val="center"/>
+              <w:rPr>
+                <w:rFonts w:ascii="Century" w:hAnsi="Century"/>
                 <w:b/>
                 <w:bCs/>
                 <w:sz w:val="21"/>
@@ -100,6 +141,7 @@
             </w:pPr>
             <w:r>
               <w:rPr>
+                <w:rFonts w:ascii="Century" w:hAnsi="Century"/>
                 <w:b/>
                 <w:bCs/>
                 <w:sz w:val="21"/>
@@ -112,13 +154,20 @@
         <w:tc>
           <w:tcPr>
             <w:tcW w:w="990" w:type="dxa"/>
-            <w:vAlign w:val="center"/>
-          </w:tcPr>
-          <w:p>
-            <w:pPr>
-              <w:ind w:left="90" w:hanging="90"/>
-              <w:jc w:val="center"/>
-              <w:rPr>
+            <w:tcBorders>
+              <w:top w:val="single" w:sz="4" w:space="0" w:color="auto"/>
+              <w:left w:val="single" w:sz="4" w:space="0" w:color="auto"/>
+              <w:bottom w:val="double" w:sz="4" w:space="0" w:color="auto"/>
+              <w:right w:val="single" w:sz="4" w:space="0" w:color="auto"/>
+            </w:tcBorders>
+            <w:vAlign w:val="center"/>
+          </w:tcPr>
+          <w:p>
+            <w:pPr>
+              <w:ind w:left="90" w:hanging="90"/>
+              <w:jc w:val="center"/>
+              <w:rPr>
+                <w:rFonts w:ascii="Century" w:hAnsi="Century"/>
                 <w:b/>
                 <w:bCs/>
                 <w:sz w:val="21"/>
@@ -127,6 +176,7 @@
             </w:pPr>
             <w:r>
               <w:rPr>
+                <w:rFonts w:ascii="Century" w:hAnsi="Century"/>
                 <w:b/>
                 <w:bCs/>
                 <w:sz w:val="21"/>
@@ -139,13 +189,19 @@
         <w:tc>
           <w:tcPr>
             <w:tcW w:w="1080" w:type="dxa"/>
-            <w:vAlign w:val="center"/>
-          </w:tcPr>
-          <w:p>
-            <w:pPr>
-              <w:ind w:left="90" w:hanging="90"/>
-              <w:jc w:val="center"/>
-              <w:rPr>
+            <w:tcBorders>
+              <w:top w:val="single" w:sz="4" w:space="0" w:color="auto"/>
+              <w:left w:val="single" w:sz="4" w:space="0" w:color="auto"/>
+              <w:bottom w:val="double" w:sz="4" w:space="0" w:color="auto"/>
+            </w:tcBorders>
+            <w:vAlign w:val="center"/>
+          </w:tcPr>
+          <w:p>
+            <w:pPr>
+              <w:ind w:left="90" w:hanging="90"/>
+              <w:jc w:val="center"/>
+              <w:rPr>
+                <w:rFonts w:ascii="Century" w:hAnsi="Century"/>
                 <w:b/>
                 <w:bCs/>
                 <w:sz w:val="21"/>
@@ -154,6 +210,7 @@
             </w:pPr>
             <w:r>
               <w:rPr>
+                <w:rFonts w:ascii="Century" w:hAnsi="Century"/>
                 <w:b/>
                 <w:bCs/>
                 <w:sz w:val="21"/>
@@ -166,19 +223,33 @@
       </w:tr>
       <w:tr>
         <w:trPr>
-          <w:trHeight w:val="360"/>
+          <w:trHeight w:val="403"/>
         </w:trPr>
         <w:tc>
           <w:tcPr>
             <w:tcW w:w="1885" w:type="dxa"/>
-            <w:vAlign w:val="center"/>
-          </w:tcPr>
-          <w:p>
-            <w:pPr>
-              <w:ind w:left="90" w:hanging="90"/>
-              <w:jc w:val="center"/>
-            </w:pPr>
-            <w:r>
+            <w:tcBorders>
+              <w:top w:val="double" w:sz="4" w:space="0" w:color="auto"/>
+              <w:right w:val="single" w:sz="4" w:space="0" w:color="auto"/>
+            </w:tcBorders>
+            <w:vAlign w:val="center"/>
+          </w:tcPr>
+          <w:p>
+            <w:pPr>
+              <w:ind w:left="90" w:hanging="90"/>
+              <w:jc w:val="center"/>
+              <w:rPr>
+                <w:rFonts w:ascii="Century" w:hAnsi="Century"/>
+                <w:sz w:val="21"/>
+                <w:szCs w:val="21"/>
+              </w:rPr>
+            </w:pPr>
+            <w:r>
+              <w:rPr>
+                <w:rFonts w:ascii="Century" w:hAnsi="Century"/>
+                <w:sz w:val="21"/>
+                <w:szCs w:val="21"/>
+              </w:rPr>
               <w:t>Empire Bell</w:t>
             </w:r>
           </w:p>
@@ -186,14 +257,29 @@
         <w:tc>
           <w:tcPr>
             <w:tcW w:w="900" w:type="dxa"/>
-            <w:vAlign w:val="center"/>
-          </w:tcPr>
-          <w:p>
-            <w:pPr>
-              <w:ind w:left="90" w:hanging="90"/>
-              <w:jc w:val="center"/>
-            </w:pPr>
-            <w:r>
+            <w:tcBorders>
+              <w:top w:val="double" w:sz="4" w:space="0" w:color="auto"/>
+              <w:left w:val="single" w:sz="4" w:space="0" w:color="auto"/>
+              <w:right w:val="single" w:sz="4" w:space="0" w:color="auto"/>
+            </w:tcBorders>
+            <w:vAlign w:val="center"/>
+          </w:tcPr>
+          <w:p>
+            <w:pPr>
+              <w:ind w:left="90" w:hanging="90"/>
+              <w:jc w:val="center"/>
+              <w:rPr>
+                <w:rFonts w:ascii="Century" w:hAnsi="Century"/>
+                <w:sz w:val="21"/>
+                <w:szCs w:val="21"/>
+              </w:rPr>
+            </w:pPr>
+            <w:r>
+              <w:rPr>
+                <w:rFonts w:ascii="Century" w:hAnsi="Century"/>
+                <w:sz w:val="21"/>
+                <w:szCs w:val="21"/>
+              </w:rPr>
               <w:t>30m</w:t>
             </w:r>
           </w:p>
@@ -201,14 +287,29 @@
         <w:tc>
           <w:tcPr>
             <w:tcW w:w="990" w:type="dxa"/>
-            <w:vAlign w:val="center"/>
-          </w:tcPr>
-          <w:p>
-            <w:pPr>
-              <w:ind w:left="90" w:hanging="90"/>
-              <w:jc w:val="center"/>
-            </w:pPr>
-            <w:r>
+            <w:tcBorders>
+              <w:top w:val="double" w:sz="4" w:space="0" w:color="auto"/>
+              <w:left w:val="single" w:sz="4" w:space="0" w:color="auto"/>
+              <w:right w:val="single" w:sz="4" w:space="0" w:color="auto"/>
+            </w:tcBorders>
+            <w:vAlign w:val="center"/>
+          </w:tcPr>
+          <w:p>
+            <w:pPr>
+              <w:ind w:left="90" w:hanging="90"/>
+              <w:jc w:val="center"/>
+              <w:rPr>
+                <w:rFonts w:ascii="Century" w:hAnsi="Century"/>
+                <w:sz w:val="21"/>
+                <w:szCs w:val="21"/>
+              </w:rPr>
+            </w:pPr>
+            <w:r>
+              <w:rPr>
+                <w:rFonts w:ascii="Century" w:hAnsi="Century"/>
+                <w:sz w:val="21"/>
+                <w:szCs w:val="21"/>
+              </w:rPr>
               <w:t>99m</w:t>
             </w:r>
           </w:p>
@@ -216,14 +317,28 @@
         <w:tc>
           <w:tcPr>
             <w:tcW w:w="1080" w:type="dxa"/>
-            <w:vAlign w:val="center"/>
-          </w:tcPr>
-          <w:p>
-            <w:pPr>
-              <w:ind w:left="90" w:hanging="90"/>
-              <w:jc w:val="center"/>
-            </w:pPr>
-            <w:r>
+            <w:tcBorders>
+              <w:top w:val="double" w:sz="4" w:space="0" w:color="auto"/>
+              <w:left w:val="single" w:sz="4" w:space="0" w:color="auto"/>
+            </w:tcBorders>
+            <w:vAlign w:val="center"/>
+          </w:tcPr>
+          <w:p>
+            <w:pPr>
+              <w:ind w:left="90" w:hanging="90"/>
+              <w:jc w:val="center"/>
+              <w:rPr>
+                <w:rFonts w:ascii="Century" w:hAnsi="Century"/>
+                <w:sz w:val="21"/>
+                <w:szCs w:val="21"/>
+              </w:rPr>
+            </w:pPr>
+            <w:r>
+              <w:rPr>
+                <w:rFonts w:ascii="Century" w:hAnsi="Century"/>
+                <w:sz w:val="21"/>
+                <w:szCs w:val="21"/>
+              </w:rPr>
               <w:t>8.5m</w:t>
             </w:r>
           </w:p>
@@ -231,19 +346,32 @@
       </w:tr>
       <w:tr>
         <w:trPr>
-          <w:trHeight w:val="360"/>
+          <w:trHeight w:val="403"/>
         </w:trPr>
         <w:tc>
           <w:tcPr>
             <w:tcW w:w="1885" w:type="dxa"/>
-            <w:vAlign w:val="center"/>
-          </w:tcPr>
-          <w:p>
-            <w:pPr>
-              <w:ind w:left="90" w:hanging="90"/>
-              <w:jc w:val="center"/>
-            </w:pPr>
-            <w:r>
+            <w:tcBorders>
+              <w:right w:val="single" w:sz="4" w:space="0" w:color="auto"/>
+            </w:tcBorders>
+            <w:vAlign w:val="center"/>
+          </w:tcPr>
+          <w:p>
+            <w:pPr>
+              <w:ind w:left="90" w:hanging="90"/>
+              <w:jc w:val="center"/>
+              <w:rPr>
+                <w:rFonts w:ascii="Century" w:hAnsi="Century"/>
+                <w:sz w:val="21"/>
+                <w:szCs w:val="21"/>
+              </w:rPr>
+            </w:pPr>
+            <w:r>
+              <w:rPr>
+                <w:rFonts w:ascii="Century" w:hAnsi="Century"/>
+                <w:sz w:val="21"/>
+                <w:szCs w:val="21"/>
+              </w:rPr>
               <w:t>Empire Tower</w:t>
             </w:r>
           </w:p>
@@ -251,14 +379,28 @@
         <w:tc>
           <w:tcPr>
             <w:tcW w:w="900" w:type="dxa"/>
-            <w:vAlign w:val="center"/>
-          </w:tcPr>
-          <w:p>
-            <w:pPr>
-              <w:ind w:left="90" w:hanging="90"/>
-              <w:jc w:val="center"/>
-            </w:pPr>
-            <w:r>
+            <w:tcBorders>
+              <w:left w:val="single" w:sz="4" w:space="0" w:color="auto"/>
+              <w:right w:val="single" w:sz="4" w:space="0" w:color="auto"/>
+            </w:tcBorders>
+            <w:vAlign w:val="center"/>
+          </w:tcPr>
+          <w:p>
+            <w:pPr>
+              <w:ind w:left="90" w:hanging="90"/>
+              <w:jc w:val="center"/>
+              <w:rPr>
+                <w:rFonts w:ascii="Century" w:hAnsi="Century"/>
+                <w:sz w:val="21"/>
+                <w:szCs w:val="21"/>
+              </w:rPr>
+            </w:pPr>
+            <w:r>
+              <w:rPr>
+                <w:rFonts w:ascii="Century" w:hAnsi="Century"/>
+                <w:sz w:val="21"/>
+                <w:szCs w:val="21"/>
+              </w:rPr>
               <w:t>33m</w:t>
             </w:r>
           </w:p>
@@ -266,14 +408,28 @@
         <w:tc>
           <w:tcPr>
             <w:tcW w:w="990" w:type="dxa"/>
-            <w:vAlign w:val="center"/>
-          </w:tcPr>
-          <w:p>
-            <w:pPr>
-              <w:ind w:left="90" w:hanging="90"/>
-              <w:jc w:val="center"/>
-            </w:pPr>
-            <w:r>
+            <w:tcBorders>
+              <w:left w:val="single" w:sz="4" w:space="0" w:color="auto"/>
+              <w:right w:val="single" w:sz="4" w:space="0" w:color="auto"/>
+            </w:tcBorders>
+            <w:vAlign w:val="center"/>
+          </w:tcPr>
+          <w:p>
+            <w:pPr>
+              <w:ind w:left="90" w:hanging="90"/>
+              <w:jc w:val="center"/>
+              <w:rPr>
+                <w:rFonts w:ascii="Century" w:hAnsi="Century"/>
+                <w:sz w:val="21"/>
+                <w:szCs w:val="21"/>
+              </w:rPr>
+            </w:pPr>
+            <w:r>
+              <w:rPr>
+                <w:rFonts w:ascii="Century" w:hAnsi="Century"/>
+                <w:sz w:val="21"/>
+                <w:szCs w:val="21"/>
+              </w:rPr>
               <w:t>111m</w:t>
             </w:r>
           </w:p>
@@ -281,14 +437,27 @@
         <w:tc>
           <w:tcPr>
             <w:tcW w:w="1080" w:type="dxa"/>
-            <w:vAlign w:val="center"/>
-          </w:tcPr>
-          <w:p>
-            <w:pPr>
-              <w:ind w:left="90" w:hanging="90"/>
-              <w:jc w:val="center"/>
-            </w:pPr>
-            <w:r>
+            <w:tcBorders>
+              <w:left w:val="single" w:sz="4" w:space="0" w:color="auto"/>
+            </w:tcBorders>
+            <w:vAlign w:val="center"/>
+          </w:tcPr>
+          <w:p>
+            <w:pPr>
+              <w:ind w:left="90" w:hanging="90"/>
+              <w:jc w:val="center"/>
+              <w:rPr>
+                <w:rFonts w:ascii="Century" w:hAnsi="Century"/>
+                <w:sz w:val="21"/>
+                <w:szCs w:val="21"/>
+              </w:rPr>
+            </w:pPr>
+            <w:r>
+              <w:rPr>
+                <w:rFonts w:ascii="Century" w:hAnsi="Century"/>
+                <w:sz w:val="21"/>
+                <w:szCs w:val="21"/>
+              </w:rPr>
               <w:t>8.6m</w:t>
             </w:r>
           </w:p>
@@ -296,19 +465,32 @@
       </w:tr>
       <w:tr>
         <w:trPr>
-          <w:trHeight w:val="360"/>
+          <w:trHeight w:val="403"/>
         </w:trPr>
         <w:tc>
           <w:tcPr>
             <w:tcW w:w="1885" w:type="dxa"/>
-            <w:vAlign w:val="center"/>
-          </w:tcPr>
-          <w:p>
-            <w:pPr>
-              <w:ind w:left="90" w:hanging="90"/>
-              <w:jc w:val="center"/>
-            </w:pPr>
-            <w:r>
+            <w:tcBorders>
+              <w:right w:val="single" w:sz="4" w:space="0" w:color="auto"/>
+            </w:tcBorders>
+            <w:vAlign w:val="center"/>
+          </w:tcPr>
+          <w:p>
+            <w:pPr>
+              <w:ind w:left="90" w:hanging="90"/>
+              <w:jc w:val="center"/>
+              <w:rPr>
+                <w:rFonts w:ascii="Century" w:hAnsi="Century"/>
+                <w:sz w:val="21"/>
+                <w:szCs w:val="21"/>
+              </w:rPr>
+            </w:pPr>
+            <w:r>
+              <w:rPr>
+                <w:rFonts w:ascii="Century" w:hAnsi="Century"/>
+                <w:sz w:val="21"/>
+                <w:szCs w:val="21"/>
+              </w:rPr>
               <w:t>Empire Explorer</w:t>
             </w:r>
           </w:p>
@@ -316,14 +498,28 @@
         <w:tc>
           <w:tcPr>
             <w:tcW w:w="900" w:type="dxa"/>
-            <w:vAlign w:val="center"/>
-          </w:tcPr>
-          <w:p>
-            <w:pPr>
-              <w:ind w:left="90" w:hanging="90"/>
-              <w:jc w:val="center"/>
-            </w:pPr>
-            <w:r>
+            <w:tcBorders>
+              <w:left w:val="single" w:sz="4" w:space="0" w:color="auto"/>
+              <w:right w:val="single" w:sz="4" w:space="0" w:color="auto"/>
+            </w:tcBorders>
+            <w:vAlign w:val="center"/>
+          </w:tcPr>
+          <w:p>
+            <w:pPr>
+              <w:ind w:left="90" w:hanging="90"/>
+              <w:jc w:val="center"/>
+              <w:rPr>
+                <w:rFonts w:ascii="Century" w:hAnsi="Century"/>
+                <w:sz w:val="21"/>
+                <w:szCs w:val="21"/>
+              </w:rPr>
+            </w:pPr>
+            <w:r>
+              <w:rPr>
+                <w:rFonts w:ascii="Century" w:hAnsi="Century"/>
+                <w:sz w:val="21"/>
+                <w:szCs w:val="21"/>
+              </w:rPr>
               <w:t>35m</w:t>
             </w:r>
           </w:p>
@@ -331,14 +527,28 @@
         <w:tc>
           <w:tcPr>
             <w:tcW w:w="990" w:type="dxa"/>
-            <w:vAlign w:val="center"/>
-          </w:tcPr>
-          <w:p>
-            <w:pPr>
-              <w:ind w:left="90" w:hanging="90"/>
-              <w:jc w:val="center"/>
-            </w:pPr>
-            <w:r>
+            <w:tcBorders>
+              <w:left w:val="single" w:sz="4" w:space="0" w:color="auto"/>
+              <w:right w:val="single" w:sz="4" w:space="0" w:color="auto"/>
+            </w:tcBorders>
+            <w:vAlign w:val="center"/>
+          </w:tcPr>
+          <w:p>
+            <w:pPr>
+              <w:ind w:left="90" w:hanging="90"/>
+              <w:jc w:val="center"/>
+              <w:rPr>
+                <w:rFonts w:ascii="Century" w:hAnsi="Century"/>
+                <w:sz w:val="21"/>
+                <w:szCs w:val="21"/>
+              </w:rPr>
+            </w:pPr>
+            <w:r>
+              <w:rPr>
+                <w:rFonts w:ascii="Century" w:hAnsi="Century"/>
+                <w:sz w:val="21"/>
+                <w:szCs w:val="21"/>
+              </w:rPr>
               <w:t>123m</w:t>
             </w:r>
           </w:p>
@@ -346,14 +556,27 @@
         <w:tc>
           <w:tcPr>
             <w:tcW w:w="1080" w:type="dxa"/>
-            <w:vAlign w:val="center"/>
-          </w:tcPr>
-          <w:p>
-            <w:pPr>
-              <w:ind w:left="90" w:hanging="90"/>
-              <w:jc w:val="center"/>
-            </w:pPr>
-            <w:r>
+            <w:tcBorders>
+              <w:left w:val="single" w:sz="4" w:space="0" w:color="auto"/>
+            </w:tcBorders>
+            <w:vAlign w:val="center"/>
+          </w:tcPr>
+          <w:p>
+            <w:pPr>
+              <w:ind w:left="90" w:hanging="90"/>
+              <w:jc w:val="center"/>
+              <w:rPr>
+                <w:rFonts w:ascii="Century" w:hAnsi="Century"/>
+                <w:sz w:val="21"/>
+                <w:szCs w:val="21"/>
+              </w:rPr>
+            </w:pPr>
+            <w:r>
+              <w:rPr>
+                <w:rFonts w:ascii="Century" w:hAnsi="Century"/>
+                <w:sz w:val="21"/>
+                <w:szCs w:val="21"/>
+              </w:rPr>
               <w:t>8.7m</w:t>
             </w:r>
           </w:p>
@@ -361,19 +584,32 @@
       </w:tr>
       <w:tr>
         <w:trPr>
-          <w:trHeight w:val="360"/>
+          <w:trHeight w:val="403"/>
         </w:trPr>
         <w:tc>
           <w:tcPr>
             <w:tcW w:w="1885" w:type="dxa"/>
-            <w:vAlign w:val="center"/>
-          </w:tcPr>
-          <w:p>
-            <w:pPr>
-              <w:ind w:left="90" w:hanging="90"/>
-              <w:jc w:val="center"/>
-            </w:pPr>
-            <w:r>
+            <w:tcBorders>
+              <w:right w:val="single" w:sz="4" w:space="0" w:color="auto"/>
+            </w:tcBorders>
+            <w:vAlign w:val="center"/>
+          </w:tcPr>
+          <w:p>
+            <w:pPr>
+              <w:ind w:left="90" w:hanging="90"/>
+              <w:jc w:val="center"/>
+              <w:rPr>
+                <w:rFonts w:ascii="Century" w:hAnsi="Century"/>
+                <w:sz w:val="21"/>
+                <w:szCs w:val="21"/>
+              </w:rPr>
+            </w:pPr>
+            <w:r>
+              <w:rPr>
+                <w:rFonts w:ascii="Century" w:hAnsi="Century"/>
+                <w:sz w:val="21"/>
+                <w:szCs w:val="21"/>
+              </w:rPr>
               <w:t>Liberty</w:t>
             </w:r>
           </w:p>
@@ -381,14 +617,28 @@
         <w:tc>
           <w:tcPr>
             <w:tcW w:w="900" w:type="dxa"/>
-            <w:vAlign w:val="center"/>
-          </w:tcPr>
-          <w:p>
-            <w:pPr>
-              <w:ind w:left="90" w:hanging="90"/>
-              <w:jc w:val="center"/>
-            </w:pPr>
-            <w:r>
+            <w:tcBorders>
+              <w:left w:val="single" w:sz="4" w:space="0" w:color="auto"/>
+              <w:right w:val="single" w:sz="4" w:space="0" w:color="auto"/>
+            </w:tcBorders>
+            <w:vAlign w:val="center"/>
+          </w:tcPr>
+          <w:p>
+            <w:pPr>
+              <w:ind w:left="90" w:hanging="90"/>
+              <w:jc w:val="center"/>
+              <w:rPr>
+                <w:rFonts w:ascii="Century" w:hAnsi="Century"/>
+                <w:sz w:val="21"/>
+                <w:szCs w:val="21"/>
+              </w:rPr>
+            </w:pPr>
+            <w:r>
+              <w:rPr>
+                <w:rFonts w:ascii="Century" w:hAnsi="Century"/>
+                <w:sz w:val="21"/>
+                <w:szCs w:val="21"/>
+              </w:rPr>
               <w:t>25m</w:t>
             </w:r>
           </w:p>
@@ -396,14 +646,28 @@
         <w:tc>
           <w:tcPr>
             <w:tcW w:w="990" w:type="dxa"/>
-            <w:vAlign w:val="center"/>
-          </w:tcPr>
-          <w:p>
-            <w:pPr>
-              <w:ind w:left="90" w:hanging="90"/>
-              <w:jc w:val="center"/>
-            </w:pPr>
-            <w:r>
+            <w:tcBorders>
+              <w:left w:val="single" w:sz="4" w:space="0" w:color="auto"/>
+              <w:right w:val="single" w:sz="4" w:space="0" w:color="auto"/>
+            </w:tcBorders>
+            <w:vAlign w:val="center"/>
+          </w:tcPr>
+          <w:p>
+            <w:pPr>
+              <w:ind w:left="90" w:hanging="90"/>
+              <w:jc w:val="center"/>
+              <w:rPr>
+                <w:rFonts w:ascii="Century" w:hAnsi="Century"/>
+                <w:sz w:val="21"/>
+                <w:szCs w:val="21"/>
+              </w:rPr>
+            </w:pPr>
+            <w:r>
+              <w:rPr>
+                <w:rFonts w:ascii="Century" w:hAnsi="Century"/>
+                <w:sz w:val="21"/>
+                <w:szCs w:val="21"/>
+              </w:rPr>
               <w:t>135m</w:t>
             </w:r>
           </w:p>
@@ -411,14 +675,27 @@
         <w:tc>
           <w:tcPr>
             <w:tcW w:w="1080" w:type="dxa"/>
-            <w:vAlign w:val="center"/>
-          </w:tcPr>
-          <w:p>
-            <w:pPr>
-              <w:ind w:left="90" w:hanging="90"/>
-              <w:jc w:val="center"/>
-            </w:pPr>
-            <w:r>
+            <w:tcBorders>
+              <w:left w:val="single" w:sz="4" w:space="0" w:color="auto"/>
+            </w:tcBorders>
+            <w:vAlign w:val="center"/>
+          </w:tcPr>
+          <w:p>
+            <w:pPr>
+              <w:ind w:left="90" w:hanging="90"/>
+              <w:jc w:val="center"/>
+              <w:rPr>
+                <w:rFonts w:ascii="Century" w:hAnsi="Century"/>
+                <w:sz w:val="21"/>
+                <w:szCs w:val="21"/>
+              </w:rPr>
+            </w:pPr>
+            <w:r>
+              <w:rPr>
+                <w:rFonts w:ascii="Century" w:hAnsi="Century"/>
+                <w:sz w:val="21"/>
+                <w:szCs w:val="21"/>
+              </w:rPr>
               <w:t>8.5m</w:t>
             </w:r>
           </w:p>
@@ -426,19 +703,32 @@
       </w:tr>
       <w:tr>
         <w:trPr>
-          <w:trHeight w:val="360"/>
+          <w:trHeight w:val="403"/>
         </w:trPr>
         <w:tc>
           <w:tcPr>
             <w:tcW w:w="1885" w:type="dxa"/>
-            <w:vAlign w:val="center"/>
-          </w:tcPr>
-          <w:p>
-            <w:pPr>
-              <w:ind w:left="90" w:hanging="90"/>
-              <w:jc w:val="center"/>
-            </w:pPr>
-            <w:r>
+            <w:tcBorders>
+              <w:right w:val="single" w:sz="4" w:space="0" w:color="auto"/>
+            </w:tcBorders>
+            <w:vAlign w:val="center"/>
+          </w:tcPr>
+          <w:p>
+            <w:pPr>
+              <w:ind w:left="90" w:hanging="90"/>
+              <w:jc w:val="center"/>
+              <w:rPr>
+                <w:rFonts w:ascii="Century" w:hAnsi="Century"/>
+                <w:sz w:val="21"/>
+                <w:szCs w:val="21"/>
+              </w:rPr>
+            </w:pPr>
+            <w:r>
+              <w:rPr>
+                <w:rFonts w:ascii="Century" w:hAnsi="Century"/>
+                <w:sz w:val="21"/>
+                <w:szCs w:val="21"/>
+              </w:rPr>
               <w:t>C3</w:t>
             </w:r>
           </w:p>
@@ -446,14 +736,28 @@
         <w:tc>
           <w:tcPr>
             <w:tcW w:w="900" w:type="dxa"/>
-            <w:vAlign w:val="center"/>
-          </w:tcPr>
-          <w:p>
-            <w:pPr>
-              <w:ind w:left="90" w:hanging="90"/>
-              <w:jc w:val="center"/>
-            </w:pPr>
-            <w:r>
+            <w:tcBorders>
+              <w:left w:val="single" w:sz="4" w:space="0" w:color="auto"/>
+              <w:right w:val="single" w:sz="4" w:space="0" w:color="auto"/>
+            </w:tcBorders>
+            <w:vAlign w:val="center"/>
+          </w:tcPr>
+          <w:p>
+            <w:pPr>
+              <w:ind w:left="90" w:hanging="90"/>
+              <w:jc w:val="center"/>
+              <w:rPr>
+                <w:rFonts w:ascii="Century" w:hAnsi="Century"/>
+                <w:sz w:val="21"/>
+                <w:szCs w:val="21"/>
+              </w:rPr>
+            </w:pPr>
+            <w:r>
+              <w:rPr>
+                <w:rFonts w:ascii="Century" w:hAnsi="Century"/>
+                <w:sz w:val="21"/>
+                <w:szCs w:val="21"/>
+              </w:rPr>
               <w:t>32m</w:t>
             </w:r>
           </w:p>
@@ -461,14 +765,28 @@
         <w:tc>
           <w:tcPr>
             <w:tcW w:w="990" w:type="dxa"/>
-            <w:vAlign w:val="center"/>
-          </w:tcPr>
-          <w:p>
-            <w:pPr>
-              <w:ind w:left="90" w:hanging="90"/>
-              <w:jc w:val="center"/>
-            </w:pPr>
-            <w:r>
+            <w:tcBorders>
+              <w:left w:val="single" w:sz="4" w:space="0" w:color="auto"/>
+              <w:right w:val="single" w:sz="4" w:space="0" w:color="auto"/>
+            </w:tcBorders>
+            <w:vAlign w:val="center"/>
+          </w:tcPr>
+          <w:p>
+            <w:pPr>
+              <w:ind w:left="90" w:hanging="90"/>
+              <w:jc w:val="center"/>
+              <w:rPr>
+                <w:rFonts w:ascii="Century" w:hAnsi="Century"/>
+                <w:sz w:val="21"/>
+                <w:szCs w:val="21"/>
+              </w:rPr>
+            </w:pPr>
+            <w:r>
+              <w:rPr>
+                <w:rFonts w:ascii="Century" w:hAnsi="Century"/>
+                <w:sz w:val="21"/>
+                <w:szCs w:val="21"/>
+              </w:rPr>
               <w:t>145m</w:t>
             </w:r>
           </w:p>
@@ -476,14 +794,27 @@
         <w:tc>
           <w:tcPr>
             <w:tcW w:w="1080" w:type="dxa"/>
-            <w:vAlign w:val="center"/>
-          </w:tcPr>
-          <w:p>
-            <w:pPr>
-              <w:ind w:left="90" w:hanging="90"/>
-              <w:jc w:val="center"/>
-            </w:pPr>
-            <w:r>
+            <w:tcBorders>
+              <w:left w:val="single" w:sz="4" w:space="0" w:color="auto"/>
+            </w:tcBorders>
+            <w:vAlign w:val="center"/>
+          </w:tcPr>
+          <w:p>
+            <w:pPr>
+              <w:ind w:left="90" w:hanging="90"/>
+              <w:jc w:val="center"/>
+              <w:rPr>
+                <w:rFonts w:ascii="Century" w:hAnsi="Century"/>
+                <w:sz w:val="21"/>
+                <w:szCs w:val="21"/>
+              </w:rPr>
+            </w:pPr>
+            <w:r>
+              <w:rPr>
+                <w:rFonts w:ascii="Century" w:hAnsi="Century"/>
+                <w:sz w:val="21"/>
+                <w:szCs w:val="21"/>
+              </w:rPr>
               <w:t>8.8m</w:t>
             </w:r>
           </w:p>
@@ -491,19 +822,32 @@
       </w:tr>
       <w:tr>
         <w:trPr>
-          <w:trHeight w:val="360"/>
+          <w:trHeight w:val="403"/>
         </w:trPr>
         <w:tc>
           <w:tcPr>
             <w:tcW w:w="1885" w:type="dxa"/>
-            <w:vAlign w:val="center"/>
-          </w:tcPr>
-          <w:p>
-            <w:pPr>
-              <w:ind w:left="90" w:hanging="90"/>
-              <w:jc w:val="center"/>
-            </w:pPr>
-            <w:r>
+            <w:tcBorders>
+              <w:right w:val="single" w:sz="4" w:space="0" w:color="auto"/>
+            </w:tcBorders>
+            <w:vAlign w:val="center"/>
+          </w:tcPr>
+          <w:p>
+            <w:pPr>
+              <w:ind w:left="90" w:hanging="90"/>
+              <w:jc w:val="center"/>
+              <w:rPr>
+                <w:rFonts w:ascii="Century" w:hAnsi="Century"/>
+                <w:sz w:val="21"/>
+                <w:szCs w:val="21"/>
+              </w:rPr>
+            </w:pPr>
+            <w:r>
+              <w:rPr>
+                <w:rFonts w:ascii="Century" w:hAnsi="Century"/>
+                <w:sz w:val="21"/>
+                <w:szCs w:val="21"/>
+              </w:rPr>
               <w:t>War-Class</w:t>
             </w:r>
           </w:p>
@@ -511,14 +855,28 @@
         <w:tc>
           <w:tcPr>
             <w:tcW w:w="900" w:type="dxa"/>
-            <w:vAlign w:val="center"/>
-          </w:tcPr>
-          <w:p>
-            <w:pPr>
-              <w:ind w:left="90" w:hanging="90"/>
-              <w:jc w:val="center"/>
-            </w:pPr>
-            <w:r>
+            <w:tcBorders>
+              <w:left w:val="single" w:sz="4" w:space="0" w:color="auto"/>
+              <w:right w:val="single" w:sz="4" w:space="0" w:color="auto"/>
+            </w:tcBorders>
+            <w:vAlign w:val="center"/>
+          </w:tcPr>
+          <w:p>
+            <w:pPr>
+              <w:ind w:left="90" w:hanging="90"/>
+              <w:jc w:val="center"/>
+              <w:rPr>
+                <w:rFonts w:ascii="Century" w:hAnsi="Century"/>
+                <w:sz w:val="21"/>
+                <w:szCs w:val="21"/>
+              </w:rPr>
+            </w:pPr>
+            <w:r>
+              <w:rPr>
+                <w:rFonts w:ascii="Century" w:hAnsi="Century"/>
+                <w:sz w:val="21"/>
+                <w:szCs w:val="21"/>
+              </w:rPr>
               <w:t>23m</w:t>
             </w:r>
           </w:p>
@@ -526,14 +884,28 @@
         <w:tc>
           <w:tcPr>
             <w:tcW w:w="990" w:type="dxa"/>
-            <w:vAlign w:val="center"/>
-          </w:tcPr>
-          <w:p>
-            <w:pPr>
-              <w:ind w:left="90" w:hanging="90"/>
-              <w:jc w:val="center"/>
-            </w:pPr>
-            <w:r>
+            <w:tcBorders>
+              <w:left w:val="single" w:sz="4" w:space="0" w:color="auto"/>
+              <w:right w:val="single" w:sz="4" w:space="0" w:color="auto"/>
+            </w:tcBorders>
+            <w:vAlign w:val="center"/>
+          </w:tcPr>
+          <w:p>
+            <w:pPr>
+              <w:ind w:left="90" w:hanging="90"/>
+              <w:jc w:val="center"/>
+              <w:rPr>
+                <w:rFonts w:ascii="Century" w:hAnsi="Century"/>
+                <w:sz w:val="21"/>
+                <w:szCs w:val="21"/>
+              </w:rPr>
+            </w:pPr>
+            <w:r>
+              <w:rPr>
+                <w:rFonts w:ascii="Century" w:hAnsi="Century"/>
+                <w:sz w:val="21"/>
+                <w:szCs w:val="21"/>
+              </w:rPr>
               <w:t>120m</w:t>
             </w:r>
           </w:p>
@@ -541,14 +913,27 @@
         <w:tc>
           <w:tcPr>
             <w:tcW w:w="1080" w:type="dxa"/>
-            <w:vAlign w:val="center"/>
-          </w:tcPr>
-          <w:p>
-            <w:pPr>
-              <w:ind w:left="90" w:hanging="90"/>
-              <w:jc w:val="center"/>
-            </w:pPr>
-            <w:r>
+            <w:tcBorders>
+              <w:left w:val="single" w:sz="4" w:space="0" w:color="auto"/>
+            </w:tcBorders>
+            <w:vAlign w:val="center"/>
+          </w:tcPr>
+          <w:p>
+            <w:pPr>
+              <w:ind w:left="90" w:hanging="90"/>
+              <w:jc w:val="center"/>
+              <w:rPr>
+                <w:rFonts w:ascii="Century" w:hAnsi="Century"/>
+                <w:sz w:val="21"/>
+                <w:szCs w:val="21"/>
+              </w:rPr>
+            </w:pPr>
+            <w:r>
+              <w:rPr>
+                <w:rFonts w:ascii="Century" w:hAnsi="Century"/>
+                <w:sz w:val="21"/>
+                <w:szCs w:val="21"/>
+              </w:rPr>
               <w:t>8.4m</w:t>
             </w:r>
           </w:p>
@@ -556,19 +941,32 @@
       </w:tr>
       <w:tr>
         <w:trPr>
-          <w:trHeight w:val="360"/>
+          <w:trHeight w:val="403"/>
         </w:trPr>
         <w:tc>
           <w:tcPr>
             <w:tcW w:w="1885" w:type="dxa"/>
-            <w:vAlign w:val="center"/>
-          </w:tcPr>
-          <w:p>
-            <w:pPr>
-              <w:ind w:left="90" w:hanging="90"/>
-              <w:jc w:val="center"/>
-            </w:pPr>
-            <w:r>
+            <w:tcBorders>
+              <w:right w:val="single" w:sz="4" w:space="0" w:color="auto"/>
+            </w:tcBorders>
+            <w:vAlign w:val="center"/>
+          </w:tcPr>
+          <w:p>
+            <w:pPr>
+              <w:ind w:left="90" w:hanging="90"/>
+              <w:jc w:val="center"/>
+              <w:rPr>
+                <w:rFonts w:ascii="Century" w:hAnsi="Century"/>
+                <w:sz w:val="21"/>
+                <w:szCs w:val="21"/>
+              </w:rPr>
+            </w:pPr>
+            <w:r>
+              <w:rPr>
+                <w:rFonts w:ascii="Century" w:hAnsi="Century"/>
+                <w:sz w:val="21"/>
+                <w:szCs w:val="21"/>
+              </w:rPr>
               <w:t>N1-A1</w:t>
             </w:r>
           </w:p>
@@ -576,14 +974,28 @@
         <w:tc>
           <w:tcPr>
             <w:tcW w:w="900" w:type="dxa"/>
-            <w:vAlign w:val="center"/>
-          </w:tcPr>
-          <w:p>
-            <w:pPr>
-              <w:ind w:left="90" w:hanging="90"/>
-              <w:jc w:val="center"/>
-            </w:pPr>
-            <w:r>
+            <w:tcBorders>
+              <w:left w:val="single" w:sz="4" w:space="0" w:color="auto"/>
+              <w:right w:val="single" w:sz="4" w:space="0" w:color="auto"/>
+            </w:tcBorders>
+            <w:vAlign w:val="center"/>
+          </w:tcPr>
+          <w:p>
+            <w:pPr>
+              <w:ind w:left="90" w:hanging="90"/>
+              <w:jc w:val="center"/>
+              <w:rPr>
+                <w:rFonts w:ascii="Century" w:hAnsi="Century"/>
+                <w:sz w:val="21"/>
+                <w:szCs w:val="21"/>
+              </w:rPr>
+            </w:pPr>
+            <w:r>
+              <w:rPr>
+                <w:rFonts w:ascii="Century" w:hAnsi="Century"/>
+                <w:sz w:val="21"/>
+                <w:szCs w:val="21"/>
+              </w:rPr>
               <w:t>21m</w:t>
             </w:r>
           </w:p>
@@ -591,14 +1003,28 @@
         <w:tc>
           <w:tcPr>
             <w:tcW w:w="990" w:type="dxa"/>
-            <w:vAlign w:val="center"/>
-          </w:tcPr>
-          <w:p>
-            <w:pPr>
-              <w:ind w:left="90" w:hanging="90"/>
-              <w:jc w:val="center"/>
-            </w:pPr>
-            <w:r>
+            <w:tcBorders>
+              <w:left w:val="single" w:sz="4" w:space="0" w:color="auto"/>
+              <w:right w:val="single" w:sz="4" w:space="0" w:color="auto"/>
+            </w:tcBorders>
+            <w:vAlign w:val="center"/>
+          </w:tcPr>
+          <w:p>
+            <w:pPr>
+              <w:ind w:left="90" w:hanging="90"/>
+              <w:jc w:val="center"/>
+              <w:rPr>
+                <w:rFonts w:ascii="Century" w:hAnsi="Century"/>
+                <w:sz w:val="21"/>
+                <w:szCs w:val="21"/>
+              </w:rPr>
+            </w:pPr>
+            <w:r>
+              <w:rPr>
+                <w:rFonts w:ascii="Century" w:hAnsi="Century"/>
+                <w:sz w:val="21"/>
+                <w:szCs w:val="21"/>
+              </w:rPr>
               <w:t>79m</w:t>
             </w:r>
           </w:p>
@@ -606,14 +1032,27 @@
         <w:tc>
           <w:tcPr>
             <w:tcW w:w="1080" w:type="dxa"/>
-            <w:vAlign w:val="center"/>
-          </w:tcPr>
-          <w:p>
-            <w:pPr>
-              <w:ind w:left="90" w:hanging="90"/>
-              <w:jc w:val="center"/>
-            </w:pPr>
-            <w:r>
+            <w:tcBorders>
+              <w:left w:val="single" w:sz="4" w:space="0" w:color="auto"/>
+            </w:tcBorders>
+            <w:vAlign w:val="center"/>
+          </w:tcPr>
+          <w:p>
+            <w:pPr>
+              <w:ind w:left="90" w:hanging="90"/>
+              <w:jc w:val="center"/>
+              <w:rPr>
+                <w:rFonts w:ascii="Century" w:hAnsi="Century"/>
+                <w:sz w:val="21"/>
+                <w:szCs w:val="21"/>
+              </w:rPr>
+            </w:pPr>
+            <w:r>
+              <w:rPr>
+                <w:rFonts w:ascii="Century" w:hAnsi="Century"/>
+                <w:sz w:val="21"/>
+                <w:szCs w:val="21"/>
+              </w:rPr>
               <w:t>6.3m</w:t>
             </w:r>
           </w:p>
@@ -621,19 +1060,32 @@
       </w:tr>
       <w:tr>
         <w:trPr>
-          <w:trHeight w:val="360"/>
+          <w:trHeight w:val="403"/>
         </w:trPr>
         <w:tc>
           <w:tcPr>
             <w:tcW w:w="1885" w:type="dxa"/>
-            <w:vAlign w:val="center"/>
-          </w:tcPr>
-          <w:p>
-            <w:pPr>
-              <w:ind w:left="90" w:hanging="90"/>
-              <w:jc w:val="center"/>
-            </w:pPr>
-            <w:r>
+            <w:tcBorders>
+              <w:right w:val="single" w:sz="4" w:space="0" w:color="auto"/>
+            </w:tcBorders>
+            <w:vAlign w:val="center"/>
+          </w:tcPr>
+          <w:p>
+            <w:pPr>
+              <w:ind w:left="90" w:hanging="90"/>
+              <w:jc w:val="center"/>
+              <w:rPr>
+                <w:rFonts w:ascii="Century" w:hAnsi="Century"/>
+                <w:sz w:val="21"/>
+                <w:szCs w:val="21"/>
+              </w:rPr>
+            </w:pPr>
+            <w:r>
+              <w:rPr>
+                <w:rFonts w:ascii="Century" w:hAnsi="Century"/>
+                <w:sz w:val="21"/>
+                <w:szCs w:val="21"/>
+              </w:rPr>
               <w:t>T2</w:t>
             </w:r>
           </w:p>
@@ -641,14 +1093,28 @@
         <w:tc>
           <w:tcPr>
             <w:tcW w:w="900" w:type="dxa"/>
-            <w:vAlign w:val="center"/>
-          </w:tcPr>
-          <w:p>
-            <w:pPr>
-              <w:ind w:left="90" w:hanging="90"/>
-              <w:jc w:val="center"/>
-            </w:pPr>
-            <w:r>
+            <w:tcBorders>
+              <w:left w:val="single" w:sz="4" w:space="0" w:color="auto"/>
+              <w:right w:val="single" w:sz="4" w:space="0" w:color="auto"/>
+            </w:tcBorders>
+            <w:vAlign w:val="center"/>
+          </w:tcPr>
+          <w:p>
+            <w:pPr>
+              <w:ind w:left="90" w:hanging="90"/>
+              <w:jc w:val="center"/>
+              <w:rPr>
+                <w:rFonts w:ascii="Century" w:hAnsi="Century"/>
+                <w:sz w:val="21"/>
+                <w:szCs w:val="21"/>
+              </w:rPr>
+            </w:pPr>
+            <w:r>
+              <w:rPr>
+                <w:rFonts w:ascii="Century" w:hAnsi="Century"/>
+                <w:sz w:val="21"/>
+                <w:szCs w:val="21"/>
+              </w:rPr>
               <w:t>24m</w:t>
             </w:r>
           </w:p>
@@ -656,14 +1122,28 @@
         <w:tc>
           <w:tcPr>
             <w:tcW w:w="990" w:type="dxa"/>
-            <w:vAlign w:val="center"/>
-          </w:tcPr>
-          <w:p>
-            <w:pPr>
-              <w:ind w:left="90" w:hanging="90"/>
-              <w:jc w:val="center"/>
-            </w:pPr>
-            <w:r>
+            <w:tcBorders>
+              <w:left w:val="single" w:sz="4" w:space="0" w:color="auto"/>
+              <w:right w:val="single" w:sz="4" w:space="0" w:color="auto"/>
+            </w:tcBorders>
+            <w:vAlign w:val="center"/>
+          </w:tcPr>
+          <w:p>
+            <w:pPr>
+              <w:ind w:left="90" w:hanging="90"/>
+              <w:jc w:val="center"/>
+              <w:rPr>
+                <w:rFonts w:ascii="Century" w:hAnsi="Century"/>
+                <w:sz w:val="21"/>
+                <w:szCs w:val="21"/>
+              </w:rPr>
+            </w:pPr>
+            <w:r>
+              <w:rPr>
+                <w:rFonts w:ascii="Century" w:hAnsi="Century"/>
+                <w:sz w:val="21"/>
+                <w:szCs w:val="21"/>
+              </w:rPr>
               <w:t>159m</w:t>
             </w:r>
           </w:p>
@@ -671,14 +1151,27 @@
         <w:tc>
           <w:tcPr>
             <w:tcW w:w="1080" w:type="dxa"/>
-            <w:vAlign w:val="center"/>
-          </w:tcPr>
-          <w:p>
-            <w:pPr>
-              <w:ind w:left="90" w:hanging="90"/>
-              <w:jc w:val="center"/>
-            </w:pPr>
-            <w:r>
+            <w:tcBorders>
+              <w:left w:val="single" w:sz="4" w:space="0" w:color="auto"/>
+            </w:tcBorders>
+            <w:vAlign w:val="center"/>
+          </w:tcPr>
+          <w:p>
+            <w:pPr>
+              <w:ind w:left="90" w:hanging="90"/>
+              <w:jc w:val="center"/>
+              <w:rPr>
+                <w:rFonts w:ascii="Century" w:hAnsi="Century"/>
+                <w:sz w:val="21"/>
+                <w:szCs w:val="21"/>
+              </w:rPr>
+            </w:pPr>
+            <w:r>
+              <w:rPr>
+                <w:rFonts w:ascii="Century" w:hAnsi="Century"/>
+                <w:sz w:val="21"/>
+                <w:szCs w:val="21"/>
+              </w:rPr>
               <w:t>9.4m</w:t>
             </w:r>
           </w:p>
@@ -686,19 +1179,32 @@
       </w:tr>
       <w:tr>
         <w:trPr>
-          <w:trHeight w:val="360"/>
+          <w:trHeight w:val="403"/>
         </w:trPr>
         <w:tc>
           <w:tcPr>
             <w:tcW w:w="1885" w:type="dxa"/>
-            <w:vAlign w:val="center"/>
-          </w:tcPr>
-          <w:p>
-            <w:pPr>
-              <w:ind w:left="90" w:hanging="90"/>
-              <w:jc w:val="center"/>
-            </w:pPr>
-            <w:r>
+            <w:tcBorders>
+              <w:right w:val="single" w:sz="4" w:space="0" w:color="auto"/>
+            </w:tcBorders>
+            <w:vAlign w:val="center"/>
+          </w:tcPr>
+          <w:p>
+            <w:pPr>
+              <w:ind w:left="90" w:hanging="90"/>
+              <w:jc w:val="center"/>
+              <w:rPr>
+                <w:rFonts w:ascii="Century" w:hAnsi="Century"/>
+                <w:sz w:val="21"/>
+                <w:szCs w:val="21"/>
+              </w:rPr>
+            </w:pPr>
+            <w:r>
+              <w:rPr>
+                <w:rFonts w:ascii="Century" w:hAnsi="Century"/>
+                <w:sz w:val="21"/>
+                <w:szCs w:val="21"/>
+              </w:rPr>
               <w:t>O1-Class</w:t>
             </w:r>
           </w:p>
@@ -706,14 +1212,28 @@
         <w:tc>
           <w:tcPr>
             <w:tcW w:w="900" w:type="dxa"/>
-            <w:vAlign w:val="center"/>
-          </w:tcPr>
-          <w:p>
-            <w:pPr>
-              <w:ind w:left="90" w:hanging="90"/>
-              <w:jc w:val="center"/>
-            </w:pPr>
-            <w:r>
+            <w:tcBorders>
+              <w:left w:val="single" w:sz="4" w:space="0" w:color="auto"/>
+              <w:right w:val="single" w:sz="4" w:space="0" w:color="auto"/>
+            </w:tcBorders>
+            <w:vAlign w:val="center"/>
+          </w:tcPr>
+          <w:p>
+            <w:pPr>
+              <w:ind w:left="90" w:hanging="90"/>
+              <w:jc w:val="center"/>
+              <w:rPr>
+                <w:rFonts w:ascii="Century" w:hAnsi="Century"/>
+                <w:sz w:val="21"/>
+                <w:szCs w:val="21"/>
+              </w:rPr>
+            </w:pPr>
+            <w:r>
+              <w:rPr>
+                <w:rFonts w:ascii="Century" w:hAnsi="Century"/>
+                <w:sz w:val="21"/>
+                <w:szCs w:val="21"/>
+              </w:rPr>
               <w:t>23m</w:t>
             </w:r>
           </w:p>
@@ -721,14 +1241,28 @@
         <w:tc>
           <w:tcPr>
             <w:tcW w:w="990" w:type="dxa"/>
-            <w:vAlign w:val="center"/>
-          </w:tcPr>
-          <w:p>
-            <w:pPr>
-              <w:ind w:left="90" w:hanging="90"/>
-              <w:jc w:val="center"/>
-            </w:pPr>
-            <w:r>
+            <w:tcBorders>
+              <w:left w:val="single" w:sz="4" w:space="0" w:color="auto"/>
+              <w:right w:val="single" w:sz="4" w:space="0" w:color="auto"/>
+            </w:tcBorders>
+            <w:vAlign w:val="center"/>
+          </w:tcPr>
+          <w:p>
+            <w:pPr>
+              <w:ind w:left="90" w:hanging="90"/>
+              <w:jc w:val="center"/>
+              <w:rPr>
+                <w:rFonts w:ascii="Century" w:hAnsi="Century"/>
+                <w:sz w:val="21"/>
+                <w:szCs w:val="21"/>
+              </w:rPr>
+            </w:pPr>
+            <w:r>
+              <w:rPr>
+                <w:rFonts w:ascii="Century" w:hAnsi="Century"/>
+                <w:sz w:val="21"/>
+                <w:szCs w:val="21"/>
+              </w:rPr>
               <w:t>135m</w:t>
             </w:r>
           </w:p>
@@ -736,14 +1270,27 @@
         <w:tc>
           <w:tcPr>
             <w:tcW w:w="1080" w:type="dxa"/>
-            <w:vAlign w:val="center"/>
-          </w:tcPr>
-          <w:p>
-            <w:pPr>
-              <w:ind w:left="90" w:hanging="90"/>
-              <w:jc w:val="center"/>
-            </w:pPr>
-            <w:r>
+            <w:tcBorders>
+              <w:left w:val="single" w:sz="4" w:space="0" w:color="auto"/>
+            </w:tcBorders>
+            <w:vAlign w:val="center"/>
+          </w:tcPr>
+          <w:p>
+            <w:pPr>
+              <w:ind w:left="90" w:hanging="90"/>
+              <w:jc w:val="center"/>
+              <w:rPr>
+                <w:rFonts w:ascii="Century" w:hAnsi="Century"/>
+                <w:sz w:val="21"/>
+                <w:szCs w:val="21"/>
+              </w:rPr>
+            </w:pPr>
+            <w:r>
+              <w:rPr>
+                <w:rFonts w:ascii="Century" w:hAnsi="Century"/>
+                <w:sz w:val="21"/>
+                <w:szCs w:val="21"/>
+              </w:rPr>
               <w:t>8.3m</w:t>
             </w:r>
           </w:p>
@@ -751,19 +1298,33 @@
       </w:tr>
       <w:tr>
         <w:trPr>
-          <w:trHeight w:val="279"/>
+          <w:trHeight w:val="403"/>
         </w:trPr>
         <w:tc>
           <w:tcPr>
             <w:tcW w:w="1885" w:type="dxa"/>
-            <w:vAlign w:val="center"/>
-          </w:tcPr>
-          <w:p>
-            <w:pPr>
-              <w:ind w:left="90" w:hanging="90"/>
-              <w:jc w:val="center"/>
-            </w:pPr>
-            <w:r>
+            <w:tcBorders>
+              <w:bottom w:val="single" w:sz="4" w:space="0" w:color="auto"/>
+              <w:right w:val="single" w:sz="4" w:space="0" w:color="auto"/>
+            </w:tcBorders>
+            <w:vAlign w:val="center"/>
+          </w:tcPr>
+          <w:p>
+            <w:pPr>
+              <w:ind w:left="90" w:hanging="90"/>
+              <w:jc w:val="center"/>
+              <w:rPr>
+                <w:rFonts w:ascii="Century" w:hAnsi="Century"/>
+                <w:sz w:val="21"/>
+                <w:szCs w:val="21"/>
+              </w:rPr>
+            </w:pPr>
+            <w:r>
+              <w:rPr>
+                <w:rFonts w:ascii="Century" w:hAnsi="Century"/>
+                <w:sz w:val="21"/>
+                <w:szCs w:val="21"/>
+              </w:rPr>
               <w:t>Dale-Class</w:t>
             </w:r>
           </w:p>
@@ -771,14 +1332,29 @@
         <w:tc>
           <w:tcPr>
             <w:tcW w:w="900" w:type="dxa"/>
-            <w:vAlign w:val="center"/>
-          </w:tcPr>
-          <w:p>
-            <w:pPr>
-              <w:ind w:left="90" w:hanging="90"/>
-              <w:jc w:val="center"/>
-            </w:pPr>
-            <w:r>
+            <w:tcBorders>
+              <w:left w:val="single" w:sz="4" w:space="0" w:color="auto"/>
+              <w:bottom w:val="single" w:sz="4" w:space="0" w:color="auto"/>
+              <w:right w:val="single" w:sz="4" w:space="0" w:color="auto"/>
+            </w:tcBorders>
+            <w:vAlign w:val="center"/>
+          </w:tcPr>
+          <w:p>
+            <w:pPr>
+              <w:ind w:left="90" w:hanging="90"/>
+              <w:jc w:val="center"/>
+              <w:rPr>
+                <w:rFonts w:ascii="Century" w:hAnsi="Century"/>
+                <w:sz w:val="21"/>
+                <w:szCs w:val="21"/>
+              </w:rPr>
+            </w:pPr>
+            <w:r>
+              <w:rPr>
+                <w:rFonts w:ascii="Century" w:hAnsi="Century"/>
+                <w:sz w:val="21"/>
+                <w:szCs w:val="21"/>
+              </w:rPr>
               <w:t>23m</w:t>
             </w:r>
           </w:p>
@@ -786,14 +1362,29 @@
         <w:tc>
           <w:tcPr>
             <w:tcW w:w="990" w:type="dxa"/>
-            <w:vAlign w:val="center"/>
-          </w:tcPr>
-          <w:p>
-            <w:pPr>
-              <w:ind w:left="90" w:hanging="90"/>
-              <w:jc w:val="center"/>
-            </w:pPr>
-            <w:r>
+            <w:tcBorders>
+              <w:left w:val="single" w:sz="4" w:space="0" w:color="auto"/>
+              <w:bottom w:val="single" w:sz="4" w:space="0" w:color="auto"/>
+              <w:right w:val="single" w:sz="4" w:space="0" w:color="auto"/>
+            </w:tcBorders>
+            <w:vAlign w:val="center"/>
+          </w:tcPr>
+          <w:p>
+            <w:pPr>
+              <w:ind w:left="90" w:hanging="90"/>
+              <w:jc w:val="center"/>
+              <w:rPr>
+                <w:rFonts w:ascii="Century" w:hAnsi="Century"/>
+                <w:sz w:val="21"/>
+                <w:szCs w:val="21"/>
+              </w:rPr>
+            </w:pPr>
+            <w:r>
+              <w:rPr>
+                <w:rFonts w:ascii="Century" w:hAnsi="Century"/>
+                <w:sz w:val="21"/>
+                <w:szCs w:val="21"/>
+              </w:rPr>
               <w:t>147m</w:t>
             </w:r>
           </w:p>
@@ -801,14 +1392,28 @@
         <w:tc>
           <w:tcPr>
             <w:tcW w:w="1080" w:type="dxa"/>
-            <w:vAlign w:val="center"/>
-          </w:tcPr>
-          <w:p>
-            <w:pPr>
-              <w:ind w:left="90" w:hanging="90"/>
-              <w:jc w:val="center"/>
-            </w:pPr>
-            <w:r>
+            <w:tcBorders>
+              <w:left w:val="single" w:sz="4" w:space="0" w:color="auto"/>
+              <w:bottom w:val="single" w:sz="4" w:space="0" w:color="auto"/>
+            </w:tcBorders>
+            <w:vAlign w:val="center"/>
+          </w:tcPr>
+          <w:p>
+            <w:pPr>
+              <w:ind w:left="90" w:hanging="90"/>
+              <w:jc w:val="center"/>
+              <w:rPr>
+                <w:rFonts w:ascii="Century" w:hAnsi="Century"/>
+                <w:sz w:val="21"/>
+                <w:szCs w:val="21"/>
+              </w:rPr>
+            </w:pPr>
+            <w:r>
+              <w:rPr>
+                <w:rFonts w:ascii="Century" w:hAnsi="Century"/>
+                <w:sz w:val="21"/>
+                <w:szCs w:val="21"/>
+              </w:rPr>
               <w:t>8.4m</w:t>
             </w:r>
           </w:p>
@@ -819,8 +1424,27 @@
       <w:pPr>
         <w:pStyle w:val="Heading2"/>
         <w:ind w:left="90" w:hanging="90"/>
+        <w:rPr>
+          <w:rFonts w:ascii="Fette National Fraktur" w:hAnsi="Fette National Fraktur"/>
+          <w:sz w:val="21"/>
+          <w:szCs w:val="21"/>
+        </w:rPr>
+      </w:pPr>
+    </w:p>
+    <w:p>
+      <w:pPr>
+        <w:pStyle w:val="Heading2"/>
+        <w:ind w:left="90" w:hanging="90"/>
+        <w:rPr>
+          <w:rFonts w:ascii="Fette National Fraktur" w:hAnsi="Fette National Fraktur"/>
+          <w:color w:val="964C24" w:themeColor="accent3" w:themeShade="BF"/>
+        </w:rPr>
       </w:pPr>
       <w:r>
+        <w:rPr>
+          <w:rFonts w:ascii="Fette National Fraktur" w:hAnsi="Fette National Fraktur"/>
+          <w:color w:val="964C24" w:themeColor="accent3" w:themeShade="BF"/>
+        </w:rPr>
         <w:t>Additional</w:t>
       </w:r>
     </w:p>
@@ -828,6 +1452,14 @@
       <w:tblPr>
         <w:tblStyle w:val="TableGrid"/>
         <w:tblW w:w="4855" w:type="dxa"/>
+        <w:tblBorders>
+          <w:top w:val="none" w:sz="0" w:space="0" w:color="auto"/>
+          <w:left w:val="none" w:sz="0" w:space="0" w:color="auto"/>
+          <w:bottom w:val="none" w:sz="0" w:space="0" w:color="auto"/>
+          <w:right w:val="none" w:sz="0" w:space="0" w:color="auto"/>
+          <w:insideH w:val="none" w:sz="0" w:space="0" w:color="auto"/>
+          <w:insideV w:val="none" w:sz="0" w:space="0" w:color="auto"/>
+        </w:tblBorders>
         <w:tblLayout w:type="fixed"/>
         <w:tblLook w:val="04A0" w:firstRow="1" w:lastRow="0" w:firstColumn="1" w:lastColumn="0" w:noHBand="0" w:noVBand="1"/>
       </w:tblPr>
@@ -844,34 +1476,42 @@
         <w:tc>
           <w:tcPr>
             <w:tcW w:w="1885" w:type="dxa"/>
-            <w:vAlign w:val="center"/>
-          </w:tcPr>
-          <w:p>
-            <w:pPr>
-              <w:ind w:left="90" w:hanging="90"/>
-              <w:jc w:val="center"/>
-              <w:rPr>
+            <w:tcBorders>
+              <w:top w:val="single" w:sz="4" w:space="0" w:color="auto"/>
+              <w:bottom w:val="double" w:sz="4" w:space="0" w:color="auto"/>
+              <w:right w:val="single" w:sz="4" w:space="0" w:color="auto"/>
+            </w:tcBorders>
+            <w:vAlign w:val="center"/>
+          </w:tcPr>
+          <w:p>
+            <w:pPr>
+              <w:ind w:left="90" w:hanging="90"/>
+              <w:jc w:val="center"/>
+              <w:rPr>
+                <w:rFonts w:ascii="Cochocib Script Latin Pro" w:hAnsi="Cochocib Script Latin Pro"/>
                 <w:b/>
                 <w:bCs/>
-                <w:sz w:val="21"/>
-                <w:szCs w:val="21"/>
-              </w:rPr>
-            </w:pPr>
-            <w:r>
-              <w:rPr>
+                <w:sz w:val="32"/>
+                <w:szCs w:val="32"/>
+              </w:rPr>
+            </w:pPr>
+            <w:r>
+              <w:rPr>
+                <w:rFonts w:ascii="Cochocib Script Latin Pro" w:hAnsi="Cochocib Script Latin Pro"/>
                 <w:b/>
                 <w:bCs/>
-                <w:sz w:val="21"/>
-                <w:szCs w:val="21"/>
+                <w:sz w:val="32"/>
+                <w:szCs w:val="32"/>
               </w:rPr>
               <w:t>Ship</w:t>
             </w:r>
             <w:r>
               <w:rPr>
+                <w:rFonts w:ascii="Cochocib Script Latin Pro" w:hAnsi="Cochocib Script Latin Pro"/>
                 <w:b/>
                 <w:bCs/>
-                <w:sz w:val="21"/>
-                <w:szCs w:val="21"/>
+                <w:sz w:val="32"/>
+                <w:szCs w:val="32"/>
               </w:rPr>
               <w:t xml:space="preserve"> Type</w:t>
             </w:r>
@@ -880,25 +1520,33 @@
         <w:tc>
           <w:tcPr>
             <w:tcW w:w="900" w:type="dxa"/>
-            <w:vAlign w:val="center"/>
-          </w:tcPr>
-          <w:p>
-            <w:pPr>
-              <w:ind w:left="90" w:hanging="90"/>
-              <w:jc w:val="center"/>
-              <w:rPr>
+            <w:tcBorders>
+              <w:top w:val="single" w:sz="4" w:space="0" w:color="auto"/>
+              <w:left w:val="single" w:sz="4" w:space="0" w:color="auto"/>
+              <w:bottom w:val="double" w:sz="4" w:space="0" w:color="auto"/>
+              <w:right w:val="single" w:sz="4" w:space="0" w:color="auto"/>
+            </w:tcBorders>
+            <w:vAlign w:val="center"/>
+          </w:tcPr>
+          <w:p>
+            <w:pPr>
+              <w:ind w:left="90" w:hanging="90"/>
+              <w:jc w:val="center"/>
+              <w:rPr>
+                <w:rFonts w:ascii="Cochocib Script Latin Pro" w:hAnsi="Cochocib Script Latin Pro"/>
                 <w:b/>
                 <w:bCs/>
-                <w:sz w:val="21"/>
-                <w:szCs w:val="21"/>
-              </w:rPr>
-            </w:pPr>
-            <w:r>
-              <w:rPr>
+                <w:sz w:val="32"/>
+                <w:szCs w:val="32"/>
+              </w:rPr>
+            </w:pPr>
+            <w:r>
+              <w:rPr>
+                <w:rFonts w:ascii="Cochocib Script Latin Pro" w:hAnsi="Cochocib Script Latin Pro"/>
                 <w:b/>
                 <w:bCs/>
-                <w:sz w:val="21"/>
-                <w:szCs w:val="21"/>
+                <w:sz w:val="32"/>
+                <w:szCs w:val="32"/>
               </w:rPr>
               <w:t>Height</w:t>
             </w:r>
@@ -907,25 +1555,33 @@
         <w:tc>
           <w:tcPr>
             <w:tcW w:w="990" w:type="dxa"/>
-            <w:vAlign w:val="center"/>
-          </w:tcPr>
-          <w:p>
-            <w:pPr>
-              <w:ind w:left="90" w:hanging="90"/>
-              <w:jc w:val="center"/>
-              <w:rPr>
+            <w:tcBorders>
+              <w:top w:val="single" w:sz="4" w:space="0" w:color="auto"/>
+              <w:left w:val="single" w:sz="4" w:space="0" w:color="auto"/>
+              <w:bottom w:val="double" w:sz="4" w:space="0" w:color="auto"/>
+              <w:right w:val="single" w:sz="4" w:space="0" w:color="auto"/>
+            </w:tcBorders>
+            <w:vAlign w:val="center"/>
+          </w:tcPr>
+          <w:p>
+            <w:pPr>
+              <w:ind w:left="90" w:hanging="90"/>
+              <w:jc w:val="center"/>
+              <w:rPr>
+                <w:rFonts w:ascii="Cochocib Script Latin Pro" w:hAnsi="Cochocib Script Latin Pro"/>
                 <w:b/>
                 <w:bCs/>
-                <w:sz w:val="21"/>
-                <w:szCs w:val="21"/>
-              </w:rPr>
-            </w:pPr>
-            <w:r>
-              <w:rPr>
+                <w:sz w:val="32"/>
+                <w:szCs w:val="32"/>
+              </w:rPr>
+            </w:pPr>
+            <w:r>
+              <w:rPr>
+                <w:rFonts w:ascii="Cochocib Script Latin Pro" w:hAnsi="Cochocib Script Latin Pro"/>
                 <w:b/>
                 <w:bCs/>
-                <w:sz w:val="21"/>
-                <w:szCs w:val="21"/>
+                <w:sz w:val="32"/>
+                <w:szCs w:val="32"/>
               </w:rPr>
               <w:t>Length</w:t>
             </w:r>
@@ -934,25 +1590,32 @@
         <w:tc>
           <w:tcPr>
             <w:tcW w:w="1080" w:type="dxa"/>
-            <w:vAlign w:val="center"/>
-          </w:tcPr>
-          <w:p>
-            <w:pPr>
-              <w:ind w:left="90" w:hanging="90"/>
-              <w:jc w:val="center"/>
-              <w:rPr>
+            <w:tcBorders>
+              <w:top w:val="single" w:sz="4" w:space="0" w:color="auto"/>
+              <w:left w:val="single" w:sz="4" w:space="0" w:color="auto"/>
+              <w:bottom w:val="double" w:sz="4" w:space="0" w:color="auto"/>
+            </w:tcBorders>
+            <w:vAlign w:val="center"/>
+          </w:tcPr>
+          <w:p>
+            <w:pPr>
+              <w:ind w:left="90" w:hanging="90"/>
+              <w:jc w:val="center"/>
+              <w:rPr>
+                <w:rFonts w:ascii="Cochocib Script Latin Pro" w:hAnsi="Cochocib Script Latin Pro"/>
                 <w:b/>
                 <w:bCs/>
-                <w:sz w:val="21"/>
-                <w:szCs w:val="21"/>
-              </w:rPr>
-            </w:pPr>
-            <w:r>
-              <w:rPr>
+                <w:sz w:val="32"/>
+                <w:szCs w:val="32"/>
+              </w:rPr>
+            </w:pPr>
+            <w:r>
+              <w:rPr>
+                <w:rFonts w:ascii="Cochocib Script Latin Pro" w:hAnsi="Cochocib Script Latin Pro"/>
                 <w:b/>
                 <w:bCs/>
-                <w:sz w:val="21"/>
-                <w:szCs w:val="21"/>
+                <w:sz w:val="32"/>
+                <w:szCs w:val="32"/>
               </w:rPr>
               <w:t>Draught</w:t>
             </w:r>
@@ -966,6 +1629,11 @@
         <w:tc>
           <w:tcPr>
             <w:tcW w:w="1885" w:type="dxa"/>
+            <w:tcBorders>
+              <w:top w:val="double" w:sz="4" w:space="0" w:color="auto"/>
+              <w:bottom w:val="dotted" w:sz="4" w:space="0" w:color="auto"/>
+              <w:right w:val="single" w:sz="4" w:space="0" w:color="auto"/>
+            </w:tcBorders>
           </w:tcPr>
           <w:p>
             <w:pPr>
@@ -976,6 +1644,12 @@
         <w:tc>
           <w:tcPr>
             <w:tcW w:w="900" w:type="dxa"/>
+            <w:tcBorders>
+              <w:top w:val="double" w:sz="4" w:space="0" w:color="auto"/>
+              <w:left w:val="single" w:sz="4" w:space="0" w:color="auto"/>
+              <w:bottom w:val="dotted" w:sz="4" w:space="0" w:color="auto"/>
+              <w:right w:val="single" w:sz="4" w:space="0" w:color="auto"/>
+            </w:tcBorders>
             <w:vAlign w:val="center"/>
           </w:tcPr>
           <w:p>
@@ -988,6 +1662,12 @@
         <w:tc>
           <w:tcPr>
             <w:tcW w:w="990" w:type="dxa"/>
+            <w:tcBorders>
+              <w:top w:val="double" w:sz="4" w:space="0" w:color="auto"/>
+              <w:left w:val="single" w:sz="4" w:space="0" w:color="auto"/>
+              <w:bottom w:val="dotted" w:sz="4" w:space="0" w:color="auto"/>
+              <w:right w:val="single" w:sz="4" w:space="0" w:color="auto"/>
+            </w:tcBorders>
             <w:vAlign w:val="center"/>
           </w:tcPr>
           <w:p>
@@ -1000,6 +1680,11 @@
         <w:tc>
           <w:tcPr>
             <w:tcW w:w="1080" w:type="dxa"/>
+            <w:tcBorders>
+              <w:top w:val="double" w:sz="4" w:space="0" w:color="auto"/>
+              <w:left w:val="single" w:sz="4" w:space="0" w:color="auto"/>
+              <w:bottom w:val="dotted" w:sz="4" w:space="0" w:color="auto"/>
+            </w:tcBorders>
             <w:vAlign w:val="center"/>
           </w:tcPr>
           <w:p>
@@ -1017,6 +1702,11 @@
         <w:tc>
           <w:tcPr>
             <w:tcW w:w="1885" w:type="dxa"/>
+            <w:tcBorders>
+              <w:top w:val="dotted" w:sz="4" w:space="0" w:color="auto"/>
+              <w:bottom w:val="dotted" w:sz="4" w:space="0" w:color="auto"/>
+              <w:right w:val="single" w:sz="4" w:space="0" w:color="auto"/>
+            </w:tcBorders>
           </w:tcPr>
           <w:p>
             <w:pPr>
@@ -1027,6 +1717,12 @@
         <w:tc>
           <w:tcPr>
             <w:tcW w:w="900" w:type="dxa"/>
+            <w:tcBorders>
+              <w:top w:val="dotted" w:sz="4" w:space="0" w:color="auto"/>
+              <w:left w:val="single" w:sz="4" w:space="0" w:color="auto"/>
+              <w:bottom w:val="dotted" w:sz="4" w:space="0" w:color="auto"/>
+              <w:right w:val="single" w:sz="4" w:space="0" w:color="auto"/>
+            </w:tcBorders>
             <w:vAlign w:val="center"/>
           </w:tcPr>
           <w:p>
@@ -1039,6 +1735,12 @@
         <w:tc>
           <w:tcPr>
             <w:tcW w:w="990" w:type="dxa"/>
+            <w:tcBorders>
+              <w:top w:val="dotted" w:sz="4" w:space="0" w:color="auto"/>
+              <w:left w:val="single" w:sz="4" w:space="0" w:color="auto"/>
+              <w:bottom w:val="dotted" w:sz="4" w:space="0" w:color="auto"/>
+              <w:right w:val="single" w:sz="4" w:space="0" w:color="auto"/>
+            </w:tcBorders>
             <w:vAlign w:val="center"/>
           </w:tcPr>
           <w:p>
@@ -1051,6 +1753,11 @@
         <w:tc>
           <w:tcPr>
             <w:tcW w:w="1080" w:type="dxa"/>
+            <w:tcBorders>
+              <w:top w:val="dotted" w:sz="4" w:space="0" w:color="auto"/>
+              <w:left w:val="single" w:sz="4" w:space="0" w:color="auto"/>
+              <w:bottom w:val="dotted" w:sz="4" w:space="0" w:color="auto"/>
+            </w:tcBorders>
             <w:vAlign w:val="center"/>
           </w:tcPr>
           <w:p>
@@ -1068,6 +1775,11 @@
         <w:tc>
           <w:tcPr>
             <w:tcW w:w="1885" w:type="dxa"/>
+            <w:tcBorders>
+              <w:top w:val="dotted" w:sz="4" w:space="0" w:color="auto"/>
+              <w:bottom w:val="dotted" w:sz="4" w:space="0" w:color="auto"/>
+              <w:right w:val="single" w:sz="4" w:space="0" w:color="auto"/>
+            </w:tcBorders>
           </w:tcPr>
           <w:p>
             <w:pPr>
@@ -1078,6 +1790,12 @@
         <w:tc>
           <w:tcPr>
             <w:tcW w:w="900" w:type="dxa"/>
+            <w:tcBorders>
+              <w:top w:val="dotted" w:sz="4" w:space="0" w:color="auto"/>
+              <w:left w:val="single" w:sz="4" w:space="0" w:color="auto"/>
+              <w:bottom w:val="dotted" w:sz="4" w:space="0" w:color="auto"/>
+              <w:right w:val="single" w:sz="4" w:space="0" w:color="auto"/>
+            </w:tcBorders>
             <w:vAlign w:val="center"/>
           </w:tcPr>
           <w:p>
@@ -1090,6 +1808,12 @@
         <w:tc>
           <w:tcPr>
             <w:tcW w:w="990" w:type="dxa"/>
+            <w:tcBorders>
+              <w:top w:val="dotted" w:sz="4" w:space="0" w:color="auto"/>
+              <w:left w:val="single" w:sz="4" w:space="0" w:color="auto"/>
+              <w:bottom w:val="dotted" w:sz="4" w:space="0" w:color="auto"/>
+              <w:right w:val="single" w:sz="4" w:space="0" w:color="auto"/>
+            </w:tcBorders>
             <w:vAlign w:val="center"/>
           </w:tcPr>
           <w:p>
@@ -1102,6 +1826,11 @@
         <w:tc>
           <w:tcPr>
             <w:tcW w:w="1080" w:type="dxa"/>
+            <w:tcBorders>
+              <w:top w:val="dotted" w:sz="4" w:space="0" w:color="auto"/>
+              <w:left w:val="single" w:sz="4" w:space="0" w:color="auto"/>
+              <w:bottom w:val="dotted" w:sz="4" w:space="0" w:color="auto"/>
+            </w:tcBorders>
             <w:vAlign w:val="center"/>
           </w:tcPr>
           <w:p>
@@ -1119,6 +1848,11 @@
         <w:tc>
           <w:tcPr>
             <w:tcW w:w="1885" w:type="dxa"/>
+            <w:tcBorders>
+              <w:top w:val="dotted" w:sz="4" w:space="0" w:color="auto"/>
+              <w:bottom w:val="dotted" w:sz="4" w:space="0" w:color="auto"/>
+              <w:right w:val="single" w:sz="4" w:space="0" w:color="auto"/>
+            </w:tcBorders>
           </w:tcPr>
           <w:p>
             <w:pPr>
@@ -1129,6 +1863,12 @@
         <w:tc>
           <w:tcPr>
             <w:tcW w:w="900" w:type="dxa"/>
+            <w:tcBorders>
+              <w:top w:val="dotted" w:sz="4" w:space="0" w:color="auto"/>
+              <w:left w:val="single" w:sz="4" w:space="0" w:color="auto"/>
+              <w:bottom w:val="dotted" w:sz="4" w:space="0" w:color="auto"/>
+              <w:right w:val="single" w:sz="4" w:space="0" w:color="auto"/>
+            </w:tcBorders>
             <w:vAlign w:val="center"/>
           </w:tcPr>
           <w:p>
@@ -1141,6 +1881,12 @@
         <w:tc>
           <w:tcPr>
             <w:tcW w:w="990" w:type="dxa"/>
+            <w:tcBorders>
+              <w:top w:val="dotted" w:sz="4" w:space="0" w:color="auto"/>
+              <w:left w:val="single" w:sz="4" w:space="0" w:color="auto"/>
+              <w:bottom w:val="dotted" w:sz="4" w:space="0" w:color="auto"/>
+              <w:right w:val="single" w:sz="4" w:space="0" w:color="auto"/>
+            </w:tcBorders>
             <w:vAlign w:val="center"/>
           </w:tcPr>
           <w:p>
@@ -1153,6 +1899,11 @@
         <w:tc>
           <w:tcPr>
             <w:tcW w:w="1080" w:type="dxa"/>
+            <w:tcBorders>
+              <w:top w:val="dotted" w:sz="4" w:space="0" w:color="auto"/>
+              <w:left w:val="single" w:sz="4" w:space="0" w:color="auto"/>
+              <w:bottom w:val="dotted" w:sz="4" w:space="0" w:color="auto"/>
+            </w:tcBorders>
             <w:vAlign w:val="center"/>
           </w:tcPr>
           <w:p>
@@ -1170,6 +1921,11 @@
         <w:tc>
           <w:tcPr>
             <w:tcW w:w="1885" w:type="dxa"/>
+            <w:tcBorders>
+              <w:top w:val="dotted" w:sz="4" w:space="0" w:color="auto"/>
+              <w:bottom w:val="single" w:sz="4" w:space="0" w:color="auto"/>
+              <w:right w:val="single" w:sz="4" w:space="0" w:color="auto"/>
+            </w:tcBorders>
           </w:tcPr>
           <w:p>
             <w:pPr>
@@ -1180,6 +1936,12 @@
         <w:tc>
           <w:tcPr>
             <w:tcW w:w="900" w:type="dxa"/>
+            <w:tcBorders>
+              <w:top w:val="dotted" w:sz="4" w:space="0" w:color="auto"/>
+              <w:left w:val="single" w:sz="4" w:space="0" w:color="auto"/>
+              <w:bottom w:val="single" w:sz="4" w:space="0" w:color="auto"/>
+              <w:right w:val="single" w:sz="4" w:space="0" w:color="auto"/>
+            </w:tcBorders>
             <w:vAlign w:val="center"/>
           </w:tcPr>
           <w:p>
@@ -1192,6 +1954,12 @@
         <w:tc>
           <w:tcPr>
             <w:tcW w:w="990" w:type="dxa"/>
+            <w:tcBorders>
+              <w:top w:val="dotted" w:sz="4" w:space="0" w:color="auto"/>
+              <w:left w:val="single" w:sz="4" w:space="0" w:color="auto"/>
+              <w:bottom w:val="single" w:sz="4" w:space="0" w:color="auto"/>
+              <w:right w:val="single" w:sz="4" w:space="0" w:color="auto"/>
+            </w:tcBorders>
             <w:vAlign w:val="center"/>
           </w:tcPr>
           <w:p>
@@ -1204,6 +1972,11 @@
         <w:tc>
           <w:tcPr>
             <w:tcW w:w="1080" w:type="dxa"/>
+            <w:tcBorders>
+              <w:top w:val="dotted" w:sz="4" w:space="0" w:color="auto"/>
+              <w:left w:val="single" w:sz="4" w:space="0" w:color="auto"/>
+              <w:bottom w:val="single" w:sz="4" w:space="0" w:color="auto"/>
+            </w:tcBorders>
             <w:vAlign w:val="center"/>
           </w:tcPr>
           <w:p>
@@ -1229,11 +2002,18 @@
       <w:pPr>
         <w:pStyle w:val="Heading2"/>
         <w:ind w:left="90" w:hanging="90"/>
+        <w:rPr>
+          <w:rFonts w:ascii="Fette National Fraktur" w:hAnsi="Fette National Fraktur"/>
+        </w:rPr>
       </w:pPr>
       <w:r>
         <w:br w:type="column"/>
       </w:r>
       <w:r>
+        <w:rPr>
+          <w:rFonts w:ascii="Fette National Fraktur" w:hAnsi="Fette National Fraktur"/>
+          <w:color w:val="964C24" w:themeColor="accent3" w:themeShade="BF"/>
+        </w:rPr>
         <w:t>Warships</w:t>
       </w:r>
     </w:p>
@@ -1241,6 +2021,14 @@
       <w:tblPr>
         <w:tblStyle w:val="TableGrid"/>
         <w:tblW w:w="4855" w:type="dxa"/>
+        <w:tblBorders>
+          <w:top w:val="none" w:sz="0" w:space="0" w:color="auto"/>
+          <w:left w:val="none" w:sz="0" w:space="0" w:color="auto"/>
+          <w:bottom w:val="none" w:sz="0" w:space="0" w:color="auto"/>
+          <w:right w:val="none" w:sz="0" w:space="0" w:color="auto"/>
+          <w:insideH w:val="none" w:sz="0" w:space="0" w:color="auto"/>
+          <w:insideV w:val="none" w:sz="0" w:space="0" w:color="auto"/>
+        </w:tblBorders>
         <w:tblLayout w:type="fixed"/>
         <w:tblLook w:val="04A0" w:firstRow="1" w:lastRow="0" w:firstColumn="1" w:lastColumn="0" w:noHBand="0" w:noVBand="1"/>
       </w:tblPr>
@@ -1257,13 +2045,19 @@
         <w:tc>
           <w:tcPr>
             <w:tcW w:w="1885" w:type="dxa"/>
-            <w:vAlign w:val="center"/>
-          </w:tcPr>
-          <w:p>
-            <w:pPr>
-              <w:ind w:left="90" w:hanging="90"/>
-              <w:jc w:val="center"/>
-              <w:rPr>
+            <w:tcBorders>
+              <w:top w:val="single" w:sz="4" w:space="0" w:color="auto"/>
+              <w:bottom w:val="double" w:sz="4" w:space="0" w:color="auto"/>
+              <w:right w:val="single" w:sz="4" w:space="0" w:color="auto"/>
+            </w:tcBorders>
+            <w:vAlign w:val="center"/>
+          </w:tcPr>
+          <w:p>
+            <w:pPr>
+              <w:ind w:left="90" w:hanging="90"/>
+              <w:jc w:val="center"/>
+              <w:rPr>
+                <w:rFonts w:ascii="Century" w:hAnsi="Century"/>
                 <w:b/>
                 <w:bCs/>
                 <w:sz w:val="21"/>
@@ -1272,6 +2066,7 @@
             </w:pPr>
             <w:r>
               <w:rPr>
+                <w:rFonts w:ascii="Century" w:hAnsi="Century"/>
                 <w:b/>
                 <w:bCs/>
                 <w:sz w:val="21"/>
@@ -1281,6 +2076,7 @@
             </w:r>
             <w:r>
               <w:rPr>
+                <w:rFonts w:ascii="Century" w:hAnsi="Century"/>
                 <w:b/>
                 <w:bCs/>
                 <w:sz w:val="21"/>
@@ -1293,13 +2089,20 @@
         <w:tc>
           <w:tcPr>
             <w:tcW w:w="900" w:type="dxa"/>
-            <w:vAlign w:val="center"/>
-          </w:tcPr>
-          <w:p>
-            <w:pPr>
-              <w:ind w:left="90" w:hanging="90"/>
-              <w:jc w:val="center"/>
-              <w:rPr>
+            <w:tcBorders>
+              <w:top w:val="single" w:sz="4" w:space="0" w:color="auto"/>
+              <w:left w:val="single" w:sz="4" w:space="0" w:color="auto"/>
+              <w:bottom w:val="double" w:sz="4" w:space="0" w:color="auto"/>
+              <w:right w:val="single" w:sz="4" w:space="0" w:color="auto"/>
+            </w:tcBorders>
+            <w:vAlign w:val="center"/>
+          </w:tcPr>
+          <w:p>
+            <w:pPr>
+              <w:ind w:left="90" w:hanging="90"/>
+              <w:jc w:val="center"/>
+              <w:rPr>
+                <w:rFonts w:ascii="Century" w:hAnsi="Century"/>
                 <w:b/>
                 <w:bCs/>
                 <w:sz w:val="21"/>
@@ -1308,6 +2111,7 @@
             </w:pPr>
             <w:r>
               <w:rPr>
+                <w:rFonts w:ascii="Century" w:hAnsi="Century"/>
                 <w:b/>
                 <w:bCs/>
                 <w:sz w:val="21"/>
@@ -1320,13 +2124,20 @@
         <w:tc>
           <w:tcPr>
             <w:tcW w:w="990" w:type="dxa"/>
-            <w:vAlign w:val="center"/>
-          </w:tcPr>
-          <w:p>
-            <w:pPr>
-              <w:ind w:left="90" w:hanging="90"/>
-              <w:jc w:val="center"/>
-              <w:rPr>
+            <w:tcBorders>
+              <w:top w:val="single" w:sz="4" w:space="0" w:color="auto"/>
+              <w:left w:val="single" w:sz="4" w:space="0" w:color="auto"/>
+              <w:bottom w:val="double" w:sz="4" w:space="0" w:color="auto"/>
+              <w:right w:val="single" w:sz="4" w:space="0" w:color="auto"/>
+            </w:tcBorders>
+            <w:vAlign w:val="center"/>
+          </w:tcPr>
+          <w:p>
+            <w:pPr>
+              <w:ind w:left="90" w:hanging="90"/>
+              <w:jc w:val="center"/>
+              <w:rPr>
+                <w:rFonts w:ascii="Century" w:hAnsi="Century"/>
                 <w:b/>
                 <w:bCs/>
                 <w:sz w:val="21"/>
@@ -1335,6 +2146,7 @@
             </w:pPr>
             <w:r>
               <w:rPr>
+                <w:rFonts w:ascii="Century" w:hAnsi="Century"/>
                 <w:b/>
                 <w:bCs/>
                 <w:sz w:val="21"/>
@@ -1347,13 +2159,19 @@
         <w:tc>
           <w:tcPr>
             <w:tcW w:w="1080" w:type="dxa"/>
-            <w:vAlign w:val="center"/>
-          </w:tcPr>
-          <w:p>
-            <w:pPr>
-              <w:ind w:left="90" w:hanging="90"/>
-              <w:jc w:val="center"/>
-              <w:rPr>
+            <w:tcBorders>
+              <w:top w:val="single" w:sz="4" w:space="0" w:color="auto"/>
+              <w:left w:val="single" w:sz="4" w:space="0" w:color="auto"/>
+              <w:bottom w:val="double" w:sz="4" w:space="0" w:color="auto"/>
+            </w:tcBorders>
+            <w:vAlign w:val="center"/>
+          </w:tcPr>
+          <w:p>
+            <w:pPr>
+              <w:ind w:left="90" w:hanging="90"/>
+              <w:jc w:val="center"/>
+              <w:rPr>
+                <w:rFonts w:ascii="Century" w:hAnsi="Century"/>
                 <w:b/>
                 <w:bCs/>
                 <w:sz w:val="21"/>
@@ -1362,6 +2180,7 @@
             </w:pPr>
             <w:r>
               <w:rPr>
+                <w:rFonts w:ascii="Century" w:hAnsi="Century"/>
                 <w:b/>
                 <w:bCs/>
                 <w:sz w:val="21"/>
@@ -1374,19 +2193,33 @@
       </w:tr>
       <w:tr>
         <w:trPr>
-          <w:trHeight w:val="360"/>
+          <w:trHeight w:val="403"/>
         </w:trPr>
         <w:tc>
           <w:tcPr>
             <w:tcW w:w="1885" w:type="dxa"/>
-            <w:vAlign w:val="center"/>
-          </w:tcPr>
-          <w:p>
-            <w:pPr>
-              <w:ind w:left="90" w:hanging="90"/>
-              <w:jc w:val="center"/>
-            </w:pPr>
-            <w:r>
+            <w:tcBorders>
+              <w:top w:val="double" w:sz="4" w:space="0" w:color="auto"/>
+              <w:right w:val="single" w:sz="4" w:space="0" w:color="auto"/>
+            </w:tcBorders>
+            <w:vAlign w:val="center"/>
+          </w:tcPr>
+          <w:p>
+            <w:pPr>
+              <w:ind w:left="90" w:hanging="90"/>
+              <w:jc w:val="center"/>
+              <w:rPr>
+                <w:rFonts w:ascii="Century" w:hAnsi="Century"/>
+                <w:sz w:val="21"/>
+                <w:szCs w:val="21"/>
+              </w:rPr>
+            </w:pPr>
+            <w:r>
+              <w:rPr>
+                <w:rFonts w:ascii="Century" w:hAnsi="Century"/>
+                <w:sz w:val="21"/>
+                <w:szCs w:val="21"/>
+              </w:rPr>
               <w:t>MTB</w:t>
             </w:r>
           </w:p>
@@ -1394,14 +2227,29 @@
         <w:tc>
           <w:tcPr>
             <w:tcW w:w="900" w:type="dxa"/>
-            <w:vAlign w:val="center"/>
-          </w:tcPr>
-          <w:p>
-            <w:pPr>
-              <w:ind w:left="90" w:hanging="90"/>
-              <w:jc w:val="center"/>
-            </w:pPr>
-            <w:r>
+            <w:tcBorders>
+              <w:top w:val="double" w:sz="4" w:space="0" w:color="auto"/>
+              <w:left w:val="single" w:sz="4" w:space="0" w:color="auto"/>
+              <w:right w:val="single" w:sz="4" w:space="0" w:color="auto"/>
+            </w:tcBorders>
+            <w:vAlign w:val="center"/>
+          </w:tcPr>
+          <w:p>
+            <w:pPr>
+              <w:ind w:left="90" w:hanging="90"/>
+              <w:jc w:val="center"/>
+              <w:rPr>
+                <w:rFonts w:ascii="Century" w:hAnsi="Century"/>
+                <w:sz w:val="21"/>
+                <w:szCs w:val="21"/>
+              </w:rPr>
+            </w:pPr>
+            <w:r>
+              <w:rPr>
+                <w:rFonts w:ascii="Century" w:hAnsi="Century"/>
+                <w:sz w:val="21"/>
+                <w:szCs w:val="21"/>
+              </w:rPr>
               <w:t>7.5m</w:t>
             </w:r>
           </w:p>
@@ -1409,14 +2257,29 @@
         <w:tc>
           <w:tcPr>
             <w:tcW w:w="990" w:type="dxa"/>
-            <w:vAlign w:val="center"/>
-          </w:tcPr>
-          <w:p>
-            <w:pPr>
-              <w:ind w:left="90" w:hanging="90"/>
-              <w:jc w:val="center"/>
-            </w:pPr>
-            <w:r>
+            <w:tcBorders>
+              <w:top w:val="double" w:sz="4" w:space="0" w:color="auto"/>
+              <w:left w:val="single" w:sz="4" w:space="0" w:color="auto"/>
+              <w:right w:val="single" w:sz="4" w:space="0" w:color="auto"/>
+            </w:tcBorders>
+            <w:vAlign w:val="center"/>
+          </w:tcPr>
+          <w:p>
+            <w:pPr>
+              <w:ind w:left="90" w:hanging="90"/>
+              <w:jc w:val="center"/>
+              <w:rPr>
+                <w:rFonts w:ascii="Century" w:hAnsi="Century"/>
+                <w:sz w:val="21"/>
+                <w:szCs w:val="21"/>
+              </w:rPr>
+            </w:pPr>
+            <w:r>
+              <w:rPr>
+                <w:rFonts w:ascii="Century" w:hAnsi="Century"/>
+                <w:sz w:val="21"/>
+                <w:szCs w:val="21"/>
+              </w:rPr>
               <w:t>21.5m</w:t>
             </w:r>
           </w:p>
@@ -1424,14 +2287,28 @@
         <w:tc>
           <w:tcPr>
             <w:tcW w:w="1080" w:type="dxa"/>
-            <w:vAlign w:val="center"/>
-          </w:tcPr>
-          <w:p>
-            <w:pPr>
-              <w:ind w:left="90" w:hanging="90"/>
-              <w:jc w:val="center"/>
-            </w:pPr>
-            <w:r>
+            <w:tcBorders>
+              <w:top w:val="double" w:sz="4" w:space="0" w:color="auto"/>
+              <w:left w:val="single" w:sz="4" w:space="0" w:color="auto"/>
+            </w:tcBorders>
+            <w:vAlign w:val="center"/>
+          </w:tcPr>
+          <w:p>
+            <w:pPr>
+              <w:ind w:left="90" w:hanging="90"/>
+              <w:jc w:val="center"/>
+              <w:rPr>
+                <w:rFonts w:ascii="Century" w:hAnsi="Century"/>
+                <w:sz w:val="21"/>
+                <w:szCs w:val="21"/>
+              </w:rPr>
+            </w:pPr>
+            <w:r>
+              <w:rPr>
+                <w:rFonts w:ascii="Century" w:hAnsi="Century"/>
+                <w:sz w:val="21"/>
+                <w:szCs w:val="21"/>
+              </w:rPr>
               <w:t>1.7m</w:t>
             </w:r>
           </w:p>
@@ -1439,19 +2316,32 @@
       </w:tr>
       <w:tr>
         <w:trPr>
-          <w:trHeight w:val="360"/>
+          <w:trHeight w:val="403"/>
         </w:trPr>
         <w:tc>
           <w:tcPr>
             <w:tcW w:w="1885" w:type="dxa"/>
-            <w:vAlign w:val="center"/>
-          </w:tcPr>
-          <w:p>
-            <w:pPr>
-              <w:ind w:left="90" w:hanging="90"/>
-              <w:jc w:val="center"/>
-            </w:pPr>
-            <w:r>
+            <w:tcBorders>
+              <w:right w:val="single" w:sz="4" w:space="0" w:color="auto"/>
+            </w:tcBorders>
+            <w:vAlign w:val="center"/>
+          </w:tcPr>
+          <w:p>
+            <w:pPr>
+              <w:ind w:left="90" w:hanging="90"/>
+              <w:jc w:val="center"/>
+              <w:rPr>
+                <w:rFonts w:ascii="Century" w:hAnsi="Century"/>
+                <w:sz w:val="21"/>
+                <w:szCs w:val="21"/>
+              </w:rPr>
+            </w:pPr>
+            <w:r>
+              <w:rPr>
+                <w:rFonts w:ascii="Century" w:hAnsi="Century"/>
+                <w:sz w:val="21"/>
+                <w:szCs w:val="21"/>
+              </w:rPr>
               <w:t>Isles-Class</w:t>
             </w:r>
           </w:p>
@@ -1459,20 +2349,44 @@
         <w:tc>
           <w:tcPr>
             <w:tcW w:w="900" w:type="dxa"/>
-            <w:vAlign w:val="center"/>
-          </w:tcPr>
-          <w:p>
-            <w:pPr>
-              <w:ind w:left="90" w:hanging="90"/>
-              <w:jc w:val="center"/>
-            </w:pPr>
-            <w:r>
+            <w:tcBorders>
+              <w:left w:val="single" w:sz="4" w:space="0" w:color="auto"/>
+              <w:right w:val="single" w:sz="4" w:space="0" w:color="auto"/>
+            </w:tcBorders>
+            <w:vAlign w:val="center"/>
+          </w:tcPr>
+          <w:p>
+            <w:pPr>
+              <w:ind w:left="90" w:hanging="90"/>
+              <w:jc w:val="center"/>
+              <w:rPr>
+                <w:rFonts w:ascii="Century" w:hAnsi="Century"/>
+                <w:sz w:val="21"/>
+                <w:szCs w:val="21"/>
+              </w:rPr>
+            </w:pPr>
+            <w:r>
+              <w:rPr>
+                <w:rFonts w:ascii="Century" w:hAnsi="Century"/>
+                <w:sz w:val="21"/>
+                <w:szCs w:val="21"/>
+              </w:rPr>
               <w:t>1</w:t>
             </w:r>
             <w:r>
+              <w:rPr>
+                <w:rFonts w:ascii="Century" w:hAnsi="Century"/>
+                <w:sz w:val="21"/>
+                <w:szCs w:val="21"/>
+              </w:rPr>
               <w:t>8</w:t>
             </w:r>
             <w:r>
+              <w:rPr>
+                <w:rFonts w:ascii="Century" w:hAnsi="Century"/>
+                <w:sz w:val="21"/>
+                <w:szCs w:val="21"/>
+              </w:rPr>
               <w:t>m</w:t>
             </w:r>
           </w:p>
@@ -1480,14 +2394,28 @@
         <w:tc>
           <w:tcPr>
             <w:tcW w:w="990" w:type="dxa"/>
-            <w:vAlign w:val="center"/>
-          </w:tcPr>
-          <w:p>
-            <w:pPr>
-              <w:ind w:left="90" w:hanging="90"/>
-              <w:jc w:val="center"/>
-            </w:pPr>
-            <w:r>
+            <w:tcBorders>
+              <w:left w:val="single" w:sz="4" w:space="0" w:color="auto"/>
+              <w:right w:val="single" w:sz="4" w:space="0" w:color="auto"/>
+            </w:tcBorders>
+            <w:vAlign w:val="center"/>
+          </w:tcPr>
+          <w:p>
+            <w:pPr>
+              <w:ind w:left="90" w:hanging="90"/>
+              <w:jc w:val="center"/>
+              <w:rPr>
+                <w:rFonts w:ascii="Century" w:hAnsi="Century"/>
+                <w:sz w:val="21"/>
+                <w:szCs w:val="21"/>
+              </w:rPr>
+            </w:pPr>
+            <w:r>
+              <w:rPr>
+                <w:rFonts w:ascii="Century" w:hAnsi="Century"/>
+                <w:sz w:val="21"/>
+                <w:szCs w:val="21"/>
+              </w:rPr>
               <w:t>50m</w:t>
             </w:r>
           </w:p>
@@ -1495,14 +2423,27 @@
         <w:tc>
           <w:tcPr>
             <w:tcW w:w="1080" w:type="dxa"/>
-            <w:vAlign w:val="center"/>
-          </w:tcPr>
-          <w:p>
-            <w:pPr>
-              <w:ind w:left="90" w:hanging="90"/>
-              <w:jc w:val="center"/>
-            </w:pPr>
-            <w:r>
+            <w:tcBorders>
+              <w:left w:val="single" w:sz="4" w:space="0" w:color="auto"/>
+            </w:tcBorders>
+            <w:vAlign w:val="center"/>
+          </w:tcPr>
+          <w:p>
+            <w:pPr>
+              <w:ind w:left="90" w:hanging="90"/>
+              <w:jc w:val="center"/>
+              <w:rPr>
+                <w:rFonts w:ascii="Century" w:hAnsi="Century"/>
+                <w:sz w:val="21"/>
+                <w:szCs w:val="21"/>
+              </w:rPr>
+            </w:pPr>
+            <w:r>
+              <w:rPr>
+                <w:rFonts w:ascii="Century" w:hAnsi="Century"/>
+                <w:sz w:val="21"/>
+                <w:szCs w:val="21"/>
+              </w:rPr>
               <w:t>3.4m</w:t>
             </w:r>
           </w:p>
@@ -1510,19 +2451,32 @@
       </w:tr>
       <w:tr>
         <w:trPr>
-          <w:trHeight w:val="360"/>
+          <w:trHeight w:val="403"/>
         </w:trPr>
         <w:tc>
           <w:tcPr>
             <w:tcW w:w="1885" w:type="dxa"/>
-            <w:vAlign w:val="center"/>
-          </w:tcPr>
-          <w:p>
-            <w:pPr>
-              <w:ind w:left="90" w:hanging="90"/>
-              <w:jc w:val="center"/>
-            </w:pPr>
-            <w:r>
+            <w:tcBorders>
+              <w:right w:val="single" w:sz="4" w:space="0" w:color="auto"/>
+            </w:tcBorders>
+            <w:vAlign w:val="center"/>
+          </w:tcPr>
+          <w:p>
+            <w:pPr>
+              <w:ind w:left="90" w:hanging="90"/>
+              <w:jc w:val="center"/>
+              <w:rPr>
+                <w:rFonts w:ascii="Century" w:hAnsi="Century"/>
+                <w:sz w:val="21"/>
+                <w:szCs w:val="21"/>
+              </w:rPr>
+            </w:pPr>
+            <w:r>
+              <w:rPr>
+                <w:rFonts w:ascii="Century" w:hAnsi="Century"/>
+                <w:sz w:val="21"/>
+                <w:szCs w:val="21"/>
+              </w:rPr>
               <w:t>Flower-Class</w:t>
             </w:r>
           </w:p>
@@ -1530,20 +2484,44 @@
         <w:tc>
           <w:tcPr>
             <w:tcW w:w="900" w:type="dxa"/>
-            <w:vAlign w:val="center"/>
-          </w:tcPr>
-          <w:p>
-            <w:pPr>
-              <w:ind w:left="90" w:hanging="90"/>
-              <w:jc w:val="center"/>
-            </w:pPr>
-            <w:r>
+            <w:tcBorders>
+              <w:left w:val="single" w:sz="4" w:space="0" w:color="auto"/>
+              <w:right w:val="single" w:sz="4" w:space="0" w:color="auto"/>
+            </w:tcBorders>
+            <w:vAlign w:val="center"/>
+          </w:tcPr>
+          <w:p>
+            <w:pPr>
+              <w:ind w:left="90" w:hanging="90"/>
+              <w:jc w:val="center"/>
+              <w:rPr>
+                <w:rFonts w:ascii="Century" w:hAnsi="Century"/>
+                <w:sz w:val="21"/>
+                <w:szCs w:val="21"/>
+              </w:rPr>
+            </w:pPr>
+            <w:r>
+              <w:rPr>
+                <w:rFonts w:ascii="Century" w:hAnsi="Century"/>
+                <w:sz w:val="21"/>
+                <w:szCs w:val="21"/>
+              </w:rPr>
               <w:t>1</w:t>
             </w:r>
             <w:r>
+              <w:rPr>
+                <w:rFonts w:ascii="Century" w:hAnsi="Century"/>
+                <w:sz w:val="21"/>
+                <w:szCs w:val="21"/>
+              </w:rPr>
               <w:t>7</w:t>
             </w:r>
             <w:r>
+              <w:rPr>
+                <w:rFonts w:ascii="Century" w:hAnsi="Century"/>
+                <w:sz w:val="21"/>
+                <w:szCs w:val="21"/>
+              </w:rPr>
               <w:t>m</w:t>
             </w:r>
           </w:p>
@@ -1551,14 +2529,28 @@
         <w:tc>
           <w:tcPr>
             <w:tcW w:w="990" w:type="dxa"/>
-            <w:vAlign w:val="center"/>
-          </w:tcPr>
-          <w:p>
-            <w:pPr>
-              <w:ind w:left="90" w:hanging="90"/>
-              <w:jc w:val="center"/>
-            </w:pPr>
-            <w:r>
+            <w:tcBorders>
+              <w:left w:val="single" w:sz="4" w:space="0" w:color="auto"/>
+              <w:right w:val="single" w:sz="4" w:space="0" w:color="auto"/>
+            </w:tcBorders>
+            <w:vAlign w:val="center"/>
+          </w:tcPr>
+          <w:p>
+            <w:pPr>
+              <w:ind w:left="90" w:hanging="90"/>
+              <w:jc w:val="center"/>
+              <w:rPr>
+                <w:rFonts w:ascii="Century" w:hAnsi="Century"/>
+                <w:sz w:val="21"/>
+                <w:szCs w:val="21"/>
+              </w:rPr>
+            </w:pPr>
+            <w:r>
+              <w:rPr>
+                <w:rFonts w:ascii="Century" w:hAnsi="Century"/>
+                <w:sz w:val="21"/>
+                <w:szCs w:val="21"/>
+              </w:rPr>
               <w:t>62m</w:t>
             </w:r>
           </w:p>
@@ -1566,14 +2558,27 @@
         <w:tc>
           <w:tcPr>
             <w:tcW w:w="1080" w:type="dxa"/>
-            <w:vAlign w:val="center"/>
-          </w:tcPr>
-          <w:p>
-            <w:pPr>
-              <w:ind w:left="90" w:hanging="90"/>
-              <w:jc w:val="center"/>
-            </w:pPr>
-            <w:r>
+            <w:tcBorders>
+              <w:left w:val="single" w:sz="4" w:space="0" w:color="auto"/>
+            </w:tcBorders>
+            <w:vAlign w:val="center"/>
+          </w:tcPr>
+          <w:p>
+            <w:pPr>
+              <w:ind w:left="90" w:hanging="90"/>
+              <w:jc w:val="center"/>
+              <w:rPr>
+                <w:rFonts w:ascii="Century" w:hAnsi="Century"/>
+                <w:sz w:val="21"/>
+                <w:szCs w:val="21"/>
+              </w:rPr>
+            </w:pPr>
+            <w:r>
+              <w:rPr>
+                <w:rFonts w:ascii="Century" w:hAnsi="Century"/>
+                <w:sz w:val="21"/>
+                <w:szCs w:val="21"/>
+              </w:rPr>
               <w:t>3.5m</w:t>
             </w:r>
           </w:p>
@@ -1581,19 +2586,32 @@
       </w:tr>
       <w:tr>
         <w:trPr>
-          <w:trHeight w:val="360"/>
+          <w:trHeight w:val="403"/>
         </w:trPr>
         <w:tc>
           <w:tcPr>
             <w:tcW w:w="1885" w:type="dxa"/>
-            <w:vAlign w:val="center"/>
-          </w:tcPr>
-          <w:p>
-            <w:pPr>
-              <w:ind w:left="90" w:hanging="90"/>
-              <w:jc w:val="center"/>
-            </w:pPr>
-            <w:r>
+            <w:tcBorders>
+              <w:right w:val="single" w:sz="4" w:space="0" w:color="auto"/>
+            </w:tcBorders>
+            <w:vAlign w:val="center"/>
+          </w:tcPr>
+          <w:p>
+            <w:pPr>
+              <w:ind w:left="90" w:hanging="90"/>
+              <w:jc w:val="center"/>
+              <w:rPr>
+                <w:rFonts w:ascii="Century" w:hAnsi="Century"/>
+                <w:sz w:val="21"/>
+                <w:szCs w:val="21"/>
+              </w:rPr>
+            </w:pPr>
+            <w:r>
+              <w:rPr>
+                <w:rFonts w:ascii="Century" w:hAnsi="Century"/>
+                <w:sz w:val="21"/>
+                <w:szCs w:val="21"/>
+              </w:rPr>
               <w:t>Hunt-Class</w:t>
             </w:r>
           </w:p>
@@ -1601,14 +2619,28 @@
         <w:tc>
           <w:tcPr>
             <w:tcW w:w="900" w:type="dxa"/>
-            <w:vAlign w:val="center"/>
-          </w:tcPr>
-          <w:p>
-            <w:pPr>
-              <w:ind w:left="90" w:hanging="90"/>
-              <w:jc w:val="center"/>
-            </w:pPr>
-            <w:r>
+            <w:tcBorders>
+              <w:left w:val="single" w:sz="4" w:space="0" w:color="auto"/>
+              <w:right w:val="single" w:sz="4" w:space="0" w:color="auto"/>
+            </w:tcBorders>
+            <w:vAlign w:val="center"/>
+          </w:tcPr>
+          <w:p>
+            <w:pPr>
+              <w:ind w:left="90" w:hanging="90"/>
+              <w:jc w:val="center"/>
+              <w:rPr>
+                <w:rFonts w:ascii="Century" w:hAnsi="Century"/>
+                <w:sz w:val="21"/>
+                <w:szCs w:val="21"/>
+              </w:rPr>
+            </w:pPr>
+            <w:r>
+              <w:rPr>
+                <w:rFonts w:ascii="Century" w:hAnsi="Century"/>
+                <w:sz w:val="21"/>
+                <w:szCs w:val="21"/>
+              </w:rPr>
               <w:t>22m</w:t>
             </w:r>
           </w:p>
@@ -1616,14 +2648,28 @@
         <w:tc>
           <w:tcPr>
             <w:tcW w:w="990" w:type="dxa"/>
-            <w:vAlign w:val="center"/>
-          </w:tcPr>
-          <w:p>
-            <w:pPr>
-              <w:ind w:left="90" w:hanging="90"/>
-              <w:jc w:val="center"/>
-            </w:pPr>
-            <w:r>
+            <w:tcBorders>
+              <w:left w:val="single" w:sz="4" w:space="0" w:color="auto"/>
+              <w:right w:val="single" w:sz="4" w:space="0" w:color="auto"/>
+            </w:tcBorders>
+            <w:vAlign w:val="center"/>
+          </w:tcPr>
+          <w:p>
+            <w:pPr>
+              <w:ind w:left="90" w:hanging="90"/>
+              <w:jc w:val="center"/>
+              <w:rPr>
+                <w:rFonts w:ascii="Century" w:hAnsi="Century"/>
+                <w:sz w:val="21"/>
+                <w:szCs w:val="21"/>
+              </w:rPr>
+            </w:pPr>
+            <w:r>
+              <w:rPr>
+                <w:rFonts w:ascii="Century" w:hAnsi="Century"/>
+                <w:sz w:val="21"/>
+                <w:szCs w:val="21"/>
+              </w:rPr>
               <w:t>85m</w:t>
             </w:r>
           </w:p>
@@ -1631,14 +2677,27 @@
         <w:tc>
           <w:tcPr>
             <w:tcW w:w="1080" w:type="dxa"/>
-            <w:vAlign w:val="center"/>
-          </w:tcPr>
-          <w:p>
-            <w:pPr>
-              <w:ind w:left="90" w:hanging="90"/>
-              <w:jc w:val="center"/>
-            </w:pPr>
-            <w:r>
+            <w:tcBorders>
+              <w:left w:val="single" w:sz="4" w:space="0" w:color="auto"/>
+            </w:tcBorders>
+            <w:vAlign w:val="center"/>
+          </w:tcPr>
+          <w:p>
+            <w:pPr>
+              <w:ind w:left="90" w:hanging="90"/>
+              <w:jc w:val="center"/>
+              <w:rPr>
+                <w:rFonts w:ascii="Century" w:hAnsi="Century"/>
+                <w:sz w:val="21"/>
+                <w:szCs w:val="21"/>
+              </w:rPr>
+            </w:pPr>
+            <w:r>
+              <w:rPr>
+                <w:rFonts w:ascii="Century" w:hAnsi="Century"/>
+                <w:sz w:val="21"/>
+                <w:szCs w:val="21"/>
+              </w:rPr>
               <w:t>2.5m</w:t>
             </w:r>
           </w:p>
@@ -1646,23 +2705,41 @@
       </w:tr>
       <w:tr>
         <w:trPr>
-          <w:trHeight w:val="360"/>
+          <w:trHeight w:val="403"/>
         </w:trPr>
         <w:tc>
           <w:tcPr>
             <w:tcW w:w="1885" w:type="dxa"/>
-            <w:vAlign w:val="center"/>
-          </w:tcPr>
-          <w:p>
-            <w:pPr>
-              <w:ind w:left="90" w:hanging="90"/>
-              <w:jc w:val="center"/>
-            </w:pPr>
-            <w:r>
+            <w:tcBorders>
+              <w:right w:val="single" w:sz="4" w:space="0" w:color="auto"/>
+            </w:tcBorders>
+            <w:vAlign w:val="center"/>
+          </w:tcPr>
+          <w:p>
+            <w:pPr>
+              <w:ind w:left="90" w:hanging="90"/>
+              <w:jc w:val="center"/>
+              <w:rPr>
+                <w:rFonts w:ascii="Century" w:hAnsi="Century"/>
+                <w:sz w:val="21"/>
+                <w:szCs w:val="21"/>
+              </w:rPr>
+            </w:pPr>
+            <w:r>
+              <w:rPr>
+                <w:rFonts w:ascii="Century" w:hAnsi="Century"/>
+                <w:sz w:val="21"/>
+                <w:szCs w:val="21"/>
+              </w:rPr>
               <w:t>Black Swan-</w:t>
             </w:r>
             <w:proofErr w:type="spellStart"/>
             <w:r>
+              <w:rPr>
+                <w:rFonts w:ascii="Century" w:hAnsi="Century"/>
+                <w:sz w:val="21"/>
+                <w:szCs w:val="21"/>
+              </w:rPr>
               <w:t>Cls</w:t>
             </w:r>
             <w:proofErr w:type="spellEnd"/>
@@ -1671,14 +2748,28 @@
         <w:tc>
           <w:tcPr>
             <w:tcW w:w="900" w:type="dxa"/>
-            <w:vAlign w:val="center"/>
-          </w:tcPr>
-          <w:p>
-            <w:pPr>
-              <w:ind w:left="90" w:hanging="90"/>
-              <w:jc w:val="center"/>
-            </w:pPr>
-            <w:r>
+            <w:tcBorders>
+              <w:left w:val="single" w:sz="4" w:space="0" w:color="auto"/>
+              <w:right w:val="single" w:sz="4" w:space="0" w:color="auto"/>
+            </w:tcBorders>
+            <w:vAlign w:val="center"/>
+          </w:tcPr>
+          <w:p>
+            <w:pPr>
+              <w:ind w:left="90" w:hanging="90"/>
+              <w:jc w:val="center"/>
+              <w:rPr>
+                <w:rFonts w:ascii="Century" w:hAnsi="Century"/>
+                <w:sz w:val="21"/>
+                <w:szCs w:val="21"/>
+              </w:rPr>
+            </w:pPr>
+            <w:r>
+              <w:rPr>
+                <w:rFonts w:ascii="Century" w:hAnsi="Century"/>
+                <w:sz w:val="21"/>
+                <w:szCs w:val="21"/>
+              </w:rPr>
               <w:t>34m</w:t>
             </w:r>
           </w:p>
@@ -1686,14 +2777,28 @@
         <w:tc>
           <w:tcPr>
             <w:tcW w:w="990" w:type="dxa"/>
-            <w:vAlign w:val="center"/>
-          </w:tcPr>
-          <w:p>
-            <w:pPr>
-              <w:ind w:left="90" w:hanging="90"/>
-              <w:jc w:val="center"/>
-            </w:pPr>
-            <w:r>
+            <w:tcBorders>
+              <w:left w:val="single" w:sz="4" w:space="0" w:color="auto"/>
+              <w:right w:val="single" w:sz="4" w:space="0" w:color="auto"/>
+            </w:tcBorders>
+            <w:vAlign w:val="center"/>
+          </w:tcPr>
+          <w:p>
+            <w:pPr>
+              <w:ind w:left="90" w:hanging="90"/>
+              <w:jc w:val="center"/>
+              <w:rPr>
+                <w:rFonts w:ascii="Century" w:hAnsi="Century"/>
+                <w:sz w:val="21"/>
+                <w:szCs w:val="21"/>
+              </w:rPr>
+            </w:pPr>
+            <w:r>
+              <w:rPr>
+                <w:rFonts w:ascii="Century" w:hAnsi="Century"/>
+                <w:sz w:val="21"/>
+                <w:szCs w:val="21"/>
+              </w:rPr>
               <w:t>91m</w:t>
             </w:r>
           </w:p>
@@ -1701,14 +2806,27 @@
         <w:tc>
           <w:tcPr>
             <w:tcW w:w="1080" w:type="dxa"/>
-            <w:vAlign w:val="center"/>
-          </w:tcPr>
-          <w:p>
-            <w:pPr>
-              <w:ind w:left="90" w:hanging="90"/>
-              <w:jc w:val="center"/>
-            </w:pPr>
-            <w:r>
+            <w:tcBorders>
+              <w:left w:val="single" w:sz="4" w:space="0" w:color="auto"/>
+            </w:tcBorders>
+            <w:vAlign w:val="center"/>
+          </w:tcPr>
+          <w:p>
+            <w:pPr>
+              <w:ind w:left="90" w:hanging="90"/>
+              <w:jc w:val="center"/>
+              <w:rPr>
+                <w:rFonts w:ascii="Century" w:hAnsi="Century"/>
+                <w:sz w:val="21"/>
+                <w:szCs w:val="21"/>
+              </w:rPr>
+            </w:pPr>
+            <w:r>
+              <w:rPr>
+                <w:rFonts w:ascii="Century" w:hAnsi="Century"/>
+                <w:sz w:val="21"/>
+                <w:szCs w:val="21"/>
+              </w:rPr>
               <w:t>3.4m</w:t>
             </w:r>
           </w:p>
@@ -1716,19 +2834,32 @@
       </w:tr>
       <w:tr>
         <w:trPr>
-          <w:trHeight w:val="360"/>
+          <w:trHeight w:val="403"/>
         </w:trPr>
         <w:tc>
           <w:tcPr>
             <w:tcW w:w="1885" w:type="dxa"/>
-            <w:vAlign w:val="center"/>
-          </w:tcPr>
-          <w:p>
-            <w:pPr>
-              <w:ind w:left="90" w:hanging="90"/>
-              <w:jc w:val="center"/>
-            </w:pPr>
-            <w:r>
+            <w:tcBorders>
+              <w:right w:val="single" w:sz="4" w:space="0" w:color="auto"/>
+            </w:tcBorders>
+            <w:vAlign w:val="center"/>
+          </w:tcPr>
+          <w:p>
+            <w:pPr>
+              <w:ind w:left="90" w:hanging="90"/>
+              <w:jc w:val="center"/>
+              <w:rPr>
+                <w:rFonts w:ascii="Century" w:hAnsi="Century"/>
+                <w:sz w:val="21"/>
+                <w:szCs w:val="21"/>
+              </w:rPr>
+            </w:pPr>
+            <w:r>
+              <w:rPr>
+                <w:rFonts w:ascii="Century" w:hAnsi="Century"/>
+                <w:sz w:val="21"/>
+                <w:szCs w:val="21"/>
+              </w:rPr>
               <w:t>V-Class</w:t>
             </w:r>
           </w:p>
@@ -1736,14 +2867,28 @@
         <w:tc>
           <w:tcPr>
             <w:tcW w:w="900" w:type="dxa"/>
-            <w:vAlign w:val="center"/>
-          </w:tcPr>
-          <w:p>
-            <w:pPr>
-              <w:ind w:left="90" w:hanging="90"/>
-              <w:jc w:val="center"/>
-            </w:pPr>
-            <w:r>
+            <w:tcBorders>
+              <w:left w:val="single" w:sz="4" w:space="0" w:color="auto"/>
+              <w:right w:val="single" w:sz="4" w:space="0" w:color="auto"/>
+            </w:tcBorders>
+            <w:vAlign w:val="center"/>
+          </w:tcPr>
+          <w:p>
+            <w:pPr>
+              <w:ind w:left="90" w:hanging="90"/>
+              <w:jc w:val="center"/>
+              <w:rPr>
+                <w:rFonts w:ascii="Century" w:hAnsi="Century"/>
+                <w:sz w:val="21"/>
+                <w:szCs w:val="21"/>
+              </w:rPr>
+            </w:pPr>
+            <w:r>
+              <w:rPr>
+                <w:rFonts w:ascii="Century" w:hAnsi="Century"/>
+                <w:sz w:val="21"/>
+                <w:szCs w:val="21"/>
+              </w:rPr>
               <w:t>23m</w:t>
             </w:r>
           </w:p>
@@ -1751,14 +2896,28 @@
         <w:tc>
           <w:tcPr>
             <w:tcW w:w="990" w:type="dxa"/>
-            <w:vAlign w:val="center"/>
-          </w:tcPr>
-          <w:p>
-            <w:pPr>
-              <w:ind w:left="90" w:hanging="90"/>
-              <w:jc w:val="center"/>
-            </w:pPr>
-            <w:r>
+            <w:tcBorders>
+              <w:left w:val="single" w:sz="4" w:space="0" w:color="auto"/>
+              <w:right w:val="single" w:sz="4" w:space="0" w:color="auto"/>
+            </w:tcBorders>
+            <w:vAlign w:val="center"/>
+          </w:tcPr>
+          <w:p>
+            <w:pPr>
+              <w:ind w:left="90" w:hanging="90"/>
+              <w:jc w:val="center"/>
+              <w:rPr>
+                <w:rFonts w:ascii="Century" w:hAnsi="Century"/>
+                <w:sz w:val="21"/>
+                <w:szCs w:val="21"/>
+              </w:rPr>
+            </w:pPr>
+            <w:r>
+              <w:rPr>
+                <w:rFonts w:ascii="Century" w:hAnsi="Century"/>
+                <w:sz w:val="21"/>
+                <w:szCs w:val="21"/>
+              </w:rPr>
               <w:t>95m</w:t>
             </w:r>
           </w:p>
@@ -1766,14 +2925,27 @@
         <w:tc>
           <w:tcPr>
             <w:tcW w:w="1080" w:type="dxa"/>
-            <w:vAlign w:val="center"/>
-          </w:tcPr>
-          <w:p>
-            <w:pPr>
-              <w:ind w:left="90" w:hanging="90"/>
-              <w:jc w:val="center"/>
-            </w:pPr>
-            <w:r>
+            <w:tcBorders>
+              <w:left w:val="single" w:sz="4" w:space="0" w:color="auto"/>
+            </w:tcBorders>
+            <w:vAlign w:val="center"/>
+          </w:tcPr>
+          <w:p>
+            <w:pPr>
+              <w:ind w:left="90" w:hanging="90"/>
+              <w:jc w:val="center"/>
+              <w:rPr>
+                <w:rFonts w:ascii="Century" w:hAnsi="Century"/>
+                <w:sz w:val="21"/>
+                <w:szCs w:val="21"/>
+              </w:rPr>
+            </w:pPr>
+            <w:r>
+              <w:rPr>
+                <w:rFonts w:ascii="Century" w:hAnsi="Century"/>
+                <w:sz w:val="21"/>
+                <w:szCs w:val="21"/>
+              </w:rPr>
               <w:t>3.8m</w:t>
             </w:r>
           </w:p>
@@ -1781,19 +2953,32 @@
       </w:tr>
       <w:tr>
         <w:trPr>
-          <w:trHeight w:val="360"/>
+          <w:trHeight w:val="403"/>
         </w:trPr>
         <w:tc>
           <w:tcPr>
             <w:tcW w:w="1885" w:type="dxa"/>
-            <w:vAlign w:val="center"/>
-          </w:tcPr>
-          <w:p>
-            <w:pPr>
-              <w:ind w:left="90" w:hanging="90"/>
-              <w:jc w:val="center"/>
-            </w:pPr>
-            <w:r>
+            <w:tcBorders>
+              <w:right w:val="single" w:sz="4" w:space="0" w:color="auto"/>
+            </w:tcBorders>
+            <w:vAlign w:val="center"/>
+          </w:tcPr>
+          <w:p>
+            <w:pPr>
+              <w:ind w:left="90" w:hanging="90"/>
+              <w:jc w:val="center"/>
+              <w:rPr>
+                <w:rFonts w:ascii="Century" w:hAnsi="Century"/>
+                <w:sz w:val="21"/>
+                <w:szCs w:val="21"/>
+              </w:rPr>
+            </w:pPr>
+            <w:r>
+              <w:rPr>
+                <w:rFonts w:ascii="Century" w:hAnsi="Century"/>
+                <w:sz w:val="21"/>
+                <w:szCs w:val="21"/>
+              </w:rPr>
               <w:t>E/F-Class</w:t>
             </w:r>
           </w:p>
@@ -1801,14 +2986,28 @@
         <w:tc>
           <w:tcPr>
             <w:tcW w:w="900" w:type="dxa"/>
-            <w:vAlign w:val="center"/>
-          </w:tcPr>
-          <w:p>
-            <w:pPr>
-              <w:ind w:left="90" w:hanging="90"/>
-              <w:jc w:val="center"/>
-            </w:pPr>
-            <w:r>
+            <w:tcBorders>
+              <w:left w:val="single" w:sz="4" w:space="0" w:color="auto"/>
+              <w:right w:val="single" w:sz="4" w:space="0" w:color="auto"/>
+            </w:tcBorders>
+            <w:vAlign w:val="center"/>
+          </w:tcPr>
+          <w:p>
+            <w:pPr>
+              <w:ind w:left="90" w:hanging="90"/>
+              <w:jc w:val="center"/>
+              <w:rPr>
+                <w:rFonts w:ascii="Century" w:hAnsi="Century"/>
+                <w:sz w:val="21"/>
+                <w:szCs w:val="21"/>
+              </w:rPr>
+            </w:pPr>
+            <w:r>
+              <w:rPr>
+                <w:rFonts w:ascii="Century" w:hAnsi="Century"/>
+                <w:sz w:val="21"/>
+                <w:szCs w:val="21"/>
+              </w:rPr>
               <w:t>21m</w:t>
             </w:r>
           </w:p>
@@ -1816,14 +3015,28 @@
         <w:tc>
           <w:tcPr>
             <w:tcW w:w="990" w:type="dxa"/>
-            <w:vAlign w:val="center"/>
-          </w:tcPr>
-          <w:p>
-            <w:pPr>
-              <w:ind w:left="90" w:hanging="90"/>
-              <w:jc w:val="center"/>
-            </w:pPr>
-            <w:r>
+            <w:tcBorders>
+              <w:left w:val="single" w:sz="4" w:space="0" w:color="auto"/>
+              <w:right w:val="single" w:sz="4" w:space="0" w:color="auto"/>
+            </w:tcBorders>
+            <w:vAlign w:val="center"/>
+          </w:tcPr>
+          <w:p>
+            <w:pPr>
+              <w:ind w:left="90" w:hanging="90"/>
+              <w:jc w:val="center"/>
+              <w:rPr>
+                <w:rFonts w:ascii="Century" w:hAnsi="Century"/>
+                <w:sz w:val="21"/>
+                <w:szCs w:val="21"/>
+              </w:rPr>
+            </w:pPr>
+            <w:r>
+              <w:rPr>
+                <w:rFonts w:ascii="Century" w:hAnsi="Century"/>
+                <w:sz w:val="21"/>
+                <w:szCs w:val="21"/>
+              </w:rPr>
               <w:t>100m</w:t>
             </w:r>
           </w:p>
@@ -1831,14 +3044,27 @@
         <w:tc>
           <w:tcPr>
             <w:tcW w:w="1080" w:type="dxa"/>
-            <w:vAlign w:val="center"/>
-          </w:tcPr>
-          <w:p>
-            <w:pPr>
-              <w:ind w:left="90" w:hanging="90"/>
-              <w:jc w:val="center"/>
-            </w:pPr>
-            <w:r>
+            <w:tcBorders>
+              <w:left w:val="single" w:sz="4" w:space="0" w:color="auto"/>
+            </w:tcBorders>
+            <w:vAlign w:val="center"/>
+          </w:tcPr>
+          <w:p>
+            <w:pPr>
+              <w:ind w:left="90" w:hanging="90"/>
+              <w:jc w:val="center"/>
+              <w:rPr>
+                <w:rFonts w:ascii="Century" w:hAnsi="Century"/>
+                <w:sz w:val="21"/>
+                <w:szCs w:val="21"/>
+              </w:rPr>
+            </w:pPr>
+            <w:r>
+              <w:rPr>
+                <w:rFonts w:ascii="Century" w:hAnsi="Century"/>
+                <w:sz w:val="21"/>
+                <w:szCs w:val="21"/>
+              </w:rPr>
               <w:t>3.8m</w:t>
             </w:r>
           </w:p>
@@ -1846,19 +3072,32 @@
       </w:tr>
       <w:tr>
         <w:trPr>
-          <w:trHeight w:val="360"/>
+          <w:trHeight w:val="403"/>
         </w:trPr>
         <w:tc>
           <w:tcPr>
             <w:tcW w:w="1885" w:type="dxa"/>
-            <w:vAlign w:val="center"/>
-          </w:tcPr>
-          <w:p>
-            <w:pPr>
-              <w:ind w:left="90" w:hanging="90"/>
-              <w:jc w:val="center"/>
-            </w:pPr>
-            <w:r>
+            <w:tcBorders>
+              <w:right w:val="single" w:sz="4" w:space="0" w:color="auto"/>
+            </w:tcBorders>
+            <w:vAlign w:val="center"/>
+          </w:tcPr>
+          <w:p>
+            <w:pPr>
+              <w:ind w:left="90" w:hanging="90"/>
+              <w:jc w:val="center"/>
+              <w:rPr>
+                <w:rFonts w:ascii="Century" w:hAnsi="Century"/>
+                <w:sz w:val="21"/>
+                <w:szCs w:val="21"/>
+              </w:rPr>
+            </w:pPr>
+            <w:r>
+              <w:rPr>
+                <w:rFonts w:ascii="Century" w:hAnsi="Century"/>
+                <w:sz w:val="21"/>
+                <w:szCs w:val="21"/>
+              </w:rPr>
               <w:t>Sims-Class</w:t>
             </w:r>
           </w:p>
@@ -1866,14 +3105,28 @@
         <w:tc>
           <w:tcPr>
             <w:tcW w:w="900" w:type="dxa"/>
-            <w:vAlign w:val="center"/>
-          </w:tcPr>
-          <w:p>
-            <w:pPr>
-              <w:ind w:left="90" w:hanging="90"/>
-              <w:jc w:val="center"/>
-            </w:pPr>
-            <w:r>
+            <w:tcBorders>
+              <w:left w:val="single" w:sz="4" w:space="0" w:color="auto"/>
+              <w:right w:val="single" w:sz="4" w:space="0" w:color="auto"/>
+            </w:tcBorders>
+            <w:vAlign w:val="center"/>
+          </w:tcPr>
+          <w:p>
+            <w:pPr>
+              <w:ind w:left="90" w:hanging="90"/>
+              <w:jc w:val="center"/>
+              <w:rPr>
+                <w:rFonts w:ascii="Century" w:hAnsi="Century"/>
+                <w:sz w:val="21"/>
+                <w:szCs w:val="21"/>
+              </w:rPr>
+            </w:pPr>
+            <w:r>
+              <w:rPr>
+                <w:rFonts w:ascii="Century" w:hAnsi="Century"/>
+                <w:sz w:val="21"/>
+                <w:szCs w:val="21"/>
+              </w:rPr>
               <w:t>29m</w:t>
             </w:r>
           </w:p>
@@ -1881,14 +3134,28 @@
         <w:tc>
           <w:tcPr>
             <w:tcW w:w="990" w:type="dxa"/>
-            <w:vAlign w:val="center"/>
-          </w:tcPr>
-          <w:p>
-            <w:pPr>
-              <w:ind w:left="90" w:hanging="90"/>
-              <w:jc w:val="center"/>
-            </w:pPr>
-            <w:r>
+            <w:tcBorders>
+              <w:left w:val="single" w:sz="4" w:space="0" w:color="auto"/>
+              <w:right w:val="single" w:sz="4" w:space="0" w:color="auto"/>
+            </w:tcBorders>
+            <w:vAlign w:val="center"/>
+          </w:tcPr>
+          <w:p>
+            <w:pPr>
+              <w:ind w:left="90" w:hanging="90"/>
+              <w:jc w:val="center"/>
+              <w:rPr>
+                <w:rFonts w:ascii="Century" w:hAnsi="Century"/>
+                <w:sz w:val="21"/>
+                <w:szCs w:val="21"/>
+              </w:rPr>
+            </w:pPr>
+            <w:r>
+              <w:rPr>
+                <w:rFonts w:ascii="Century" w:hAnsi="Century"/>
+                <w:sz w:val="21"/>
+                <w:szCs w:val="21"/>
+              </w:rPr>
               <w:t>106m</w:t>
             </w:r>
           </w:p>
@@ -1896,14 +3163,27 @@
         <w:tc>
           <w:tcPr>
             <w:tcW w:w="1080" w:type="dxa"/>
-            <w:vAlign w:val="center"/>
-          </w:tcPr>
-          <w:p>
-            <w:pPr>
-              <w:ind w:left="90" w:hanging="90"/>
-              <w:jc w:val="center"/>
-            </w:pPr>
-            <w:r>
+            <w:tcBorders>
+              <w:left w:val="single" w:sz="4" w:space="0" w:color="auto"/>
+            </w:tcBorders>
+            <w:vAlign w:val="center"/>
+          </w:tcPr>
+          <w:p>
+            <w:pPr>
+              <w:ind w:left="90" w:hanging="90"/>
+              <w:jc w:val="center"/>
+              <w:rPr>
+                <w:rFonts w:ascii="Century" w:hAnsi="Century"/>
+                <w:sz w:val="21"/>
+                <w:szCs w:val="21"/>
+              </w:rPr>
+            </w:pPr>
+            <w:r>
+              <w:rPr>
+                <w:rFonts w:ascii="Century" w:hAnsi="Century"/>
+                <w:sz w:val="21"/>
+                <w:szCs w:val="21"/>
+              </w:rPr>
               <w:t>4.1m</w:t>
             </w:r>
           </w:p>
@@ -1911,19 +3191,32 @@
       </w:tr>
       <w:tr>
         <w:trPr>
-          <w:trHeight w:val="360"/>
+          <w:trHeight w:val="403"/>
         </w:trPr>
         <w:tc>
           <w:tcPr>
             <w:tcW w:w="1885" w:type="dxa"/>
-            <w:vAlign w:val="center"/>
-          </w:tcPr>
-          <w:p>
-            <w:pPr>
-              <w:ind w:left="90" w:hanging="90"/>
-              <w:jc w:val="center"/>
-            </w:pPr>
-            <w:r>
+            <w:tcBorders>
+              <w:right w:val="single" w:sz="4" w:space="0" w:color="auto"/>
+            </w:tcBorders>
+            <w:vAlign w:val="center"/>
+          </w:tcPr>
+          <w:p>
+            <w:pPr>
+              <w:ind w:left="90" w:hanging="90"/>
+              <w:jc w:val="center"/>
+              <w:rPr>
+                <w:rFonts w:ascii="Century" w:hAnsi="Century"/>
+                <w:sz w:val="21"/>
+                <w:szCs w:val="21"/>
+              </w:rPr>
+            </w:pPr>
+            <w:r>
+              <w:rPr>
+                <w:rFonts w:ascii="Century" w:hAnsi="Century"/>
+                <w:sz w:val="21"/>
+                <w:szCs w:val="21"/>
+              </w:rPr>
               <w:t>Tribal-Class</w:t>
             </w:r>
           </w:p>
@@ -1931,14 +3224,28 @@
         <w:tc>
           <w:tcPr>
             <w:tcW w:w="900" w:type="dxa"/>
-            <w:vAlign w:val="center"/>
-          </w:tcPr>
-          <w:p>
-            <w:pPr>
-              <w:ind w:left="90" w:hanging="90"/>
-              <w:jc w:val="center"/>
-            </w:pPr>
-            <w:r>
+            <w:tcBorders>
+              <w:left w:val="single" w:sz="4" w:space="0" w:color="auto"/>
+              <w:right w:val="single" w:sz="4" w:space="0" w:color="auto"/>
+            </w:tcBorders>
+            <w:vAlign w:val="center"/>
+          </w:tcPr>
+          <w:p>
+            <w:pPr>
+              <w:ind w:left="90" w:hanging="90"/>
+              <w:jc w:val="center"/>
+              <w:rPr>
+                <w:rFonts w:ascii="Century" w:hAnsi="Century"/>
+                <w:sz w:val="21"/>
+                <w:szCs w:val="21"/>
+              </w:rPr>
+            </w:pPr>
+            <w:r>
+              <w:rPr>
+                <w:rFonts w:ascii="Century" w:hAnsi="Century"/>
+                <w:sz w:val="21"/>
+                <w:szCs w:val="21"/>
+              </w:rPr>
               <w:t>30m</w:t>
             </w:r>
           </w:p>
@@ -1946,14 +3253,28 @@
         <w:tc>
           <w:tcPr>
             <w:tcW w:w="990" w:type="dxa"/>
-            <w:vAlign w:val="center"/>
-          </w:tcPr>
-          <w:p>
-            <w:pPr>
-              <w:ind w:left="90" w:hanging="90"/>
-              <w:jc w:val="center"/>
-            </w:pPr>
-            <w:r>
+            <w:tcBorders>
+              <w:left w:val="single" w:sz="4" w:space="0" w:color="auto"/>
+              <w:right w:val="single" w:sz="4" w:space="0" w:color="auto"/>
+            </w:tcBorders>
+            <w:vAlign w:val="center"/>
+          </w:tcPr>
+          <w:p>
+            <w:pPr>
+              <w:ind w:left="90" w:hanging="90"/>
+              <w:jc w:val="center"/>
+              <w:rPr>
+                <w:rFonts w:ascii="Century" w:hAnsi="Century"/>
+                <w:sz w:val="21"/>
+                <w:szCs w:val="21"/>
+              </w:rPr>
+            </w:pPr>
+            <w:r>
+              <w:rPr>
+                <w:rFonts w:ascii="Century" w:hAnsi="Century"/>
+                <w:sz w:val="21"/>
+                <w:szCs w:val="21"/>
+              </w:rPr>
               <w:t>112m</w:t>
             </w:r>
           </w:p>
@@ -1961,14 +3282,27 @@
         <w:tc>
           <w:tcPr>
             <w:tcW w:w="1080" w:type="dxa"/>
-            <w:vAlign w:val="center"/>
-          </w:tcPr>
-          <w:p>
-            <w:pPr>
-              <w:ind w:left="90" w:hanging="90"/>
-              <w:jc w:val="center"/>
-            </w:pPr>
-            <w:r>
+            <w:tcBorders>
+              <w:left w:val="single" w:sz="4" w:space="0" w:color="auto"/>
+            </w:tcBorders>
+            <w:vAlign w:val="center"/>
+          </w:tcPr>
+          <w:p>
+            <w:pPr>
+              <w:ind w:left="90" w:hanging="90"/>
+              <w:jc w:val="center"/>
+              <w:rPr>
+                <w:rFonts w:ascii="Century" w:hAnsi="Century"/>
+                <w:sz w:val="21"/>
+                <w:szCs w:val="21"/>
+              </w:rPr>
+            </w:pPr>
+            <w:r>
+              <w:rPr>
+                <w:rFonts w:ascii="Century" w:hAnsi="Century"/>
+                <w:sz w:val="21"/>
+                <w:szCs w:val="21"/>
+              </w:rPr>
               <w:t>3.4m</w:t>
             </w:r>
           </w:p>
@@ -1976,19 +3310,32 @@
       </w:tr>
       <w:tr>
         <w:trPr>
-          <w:trHeight w:val="360"/>
+          <w:trHeight w:val="403"/>
         </w:trPr>
         <w:tc>
           <w:tcPr>
             <w:tcW w:w="1885" w:type="dxa"/>
-            <w:vAlign w:val="center"/>
-          </w:tcPr>
-          <w:p>
-            <w:pPr>
-              <w:ind w:left="90" w:hanging="90"/>
-              <w:jc w:val="center"/>
-            </w:pPr>
-            <w:r>
+            <w:tcBorders>
+              <w:right w:val="single" w:sz="4" w:space="0" w:color="auto"/>
+            </w:tcBorders>
+            <w:vAlign w:val="center"/>
+          </w:tcPr>
+          <w:p>
+            <w:pPr>
+              <w:ind w:left="90" w:hanging="90"/>
+              <w:jc w:val="center"/>
+              <w:rPr>
+                <w:rFonts w:ascii="Century" w:hAnsi="Century"/>
+                <w:sz w:val="21"/>
+                <w:szCs w:val="21"/>
+              </w:rPr>
+            </w:pPr>
+            <w:r>
+              <w:rPr>
+                <w:rFonts w:ascii="Century" w:hAnsi="Century"/>
+                <w:sz w:val="21"/>
+                <w:szCs w:val="21"/>
+              </w:rPr>
               <w:t>Dido-Class</w:t>
             </w:r>
           </w:p>
@@ -1996,14 +3343,28 @@
         <w:tc>
           <w:tcPr>
             <w:tcW w:w="900" w:type="dxa"/>
-            <w:vAlign w:val="center"/>
-          </w:tcPr>
-          <w:p>
-            <w:pPr>
-              <w:ind w:left="90" w:hanging="90"/>
-              <w:jc w:val="center"/>
-            </w:pPr>
-            <w:r>
+            <w:tcBorders>
+              <w:left w:val="single" w:sz="4" w:space="0" w:color="auto"/>
+              <w:right w:val="single" w:sz="4" w:space="0" w:color="auto"/>
+            </w:tcBorders>
+            <w:vAlign w:val="center"/>
+          </w:tcPr>
+          <w:p>
+            <w:pPr>
+              <w:ind w:left="90" w:hanging="90"/>
+              <w:jc w:val="center"/>
+              <w:rPr>
+                <w:rFonts w:ascii="Century" w:hAnsi="Century"/>
+                <w:sz w:val="21"/>
+                <w:szCs w:val="21"/>
+              </w:rPr>
+            </w:pPr>
+            <w:r>
+              <w:rPr>
+                <w:rFonts w:ascii="Century" w:hAnsi="Century"/>
+                <w:sz w:val="21"/>
+                <w:szCs w:val="21"/>
+              </w:rPr>
               <w:t>38m</w:t>
             </w:r>
           </w:p>
@@ -2011,14 +3372,28 @@
         <w:tc>
           <w:tcPr>
             <w:tcW w:w="990" w:type="dxa"/>
-            <w:vAlign w:val="center"/>
-          </w:tcPr>
-          <w:p>
-            <w:pPr>
-              <w:ind w:left="90" w:hanging="90"/>
-              <w:jc w:val="center"/>
-            </w:pPr>
-            <w:r>
+            <w:tcBorders>
+              <w:left w:val="single" w:sz="4" w:space="0" w:color="auto"/>
+              <w:right w:val="single" w:sz="4" w:space="0" w:color="auto"/>
+            </w:tcBorders>
+            <w:vAlign w:val="center"/>
+          </w:tcPr>
+          <w:p>
+            <w:pPr>
+              <w:ind w:left="90" w:hanging="90"/>
+              <w:jc w:val="center"/>
+              <w:rPr>
+                <w:rFonts w:ascii="Century" w:hAnsi="Century"/>
+                <w:sz w:val="21"/>
+                <w:szCs w:val="21"/>
+              </w:rPr>
+            </w:pPr>
+            <w:r>
+              <w:rPr>
+                <w:rFonts w:ascii="Century" w:hAnsi="Century"/>
+                <w:sz w:val="21"/>
+                <w:szCs w:val="21"/>
+              </w:rPr>
               <w:t>156m</w:t>
             </w:r>
           </w:p>
@@ -2026,14 +3401,27 @@
         <w:tc>
           <w:tcPr>
             <w:tcW w:w="1080" w:type="dxa"/>
-            <w:vAlign w:val="center"/>
-          </w:tcPr>
-          <w:p>
-            <w:pPr>
-              <w:ind w:left="90" w:hanging="90"/>
-              <w:jc w:val="center"/>
-            </w:pPr>
-            <w:r>
+            <w:tcBorders>
+              <w:left w:val="single" w:sz="4" w:space="0" w:color="auto"/>
+            </w:tcBorders>
+            <w:vAlign w:val="center"/>
+          </w:tcPr>
+          <w:p>
+            <w:pPr>
+              <w:ind w:left="90" w:hanging="90"/>
+              <w:jc w:val="center"/>
+              <w:rPr>
+                <w:rFonts w:ascii="Century" w:hAnsi="Century"/>
+                <w:sz w:val="21"/>
+                <w:szCs w:val="21"/>
+              </w:rPr>
+            </w:pPr>
+            <w:r>
+              <w:rPr>
+                <w:rFonts w:ascii="Century" w:hAnsi="Century"/>
+                <w:sz w:val="21"/>
+                <w:szCs w:val="21"/>
+              </w:rPr>
               <w:t>4.3m</w:t>
             </w:r>
           </w:p>
@@ -2041,19 +3429,32 @@
       </w:tr>
       <w:tr>
         <w:trPr>
-          <w:trHeight w:val="360"/>
+          <w:trHeight w:val="403"/>
         </w:trPr>
         <w:tc>
           <w:tcPr>
             <w:tcW w:w="1885" w:type="dxa"/>
-            <w:vAlign w:val="center"/>
-          </w:tcPr>
-          <w:p>
-            <w:pPr>
-              <w:ind w:left="90" w:hanging="90"/>
-              <w:jc w:val="center"/>
-            </w:pPr>
-            <w:r>
+            <w:tcBorders>
+              <w:right w:val="single" w:sz="4" w:space="0" w:color="auto"/>
+            </w:tcBorders>
+            <w:vAlign w:val="center"/>
+          </w:tcPr>
+          <w:p>
+            <w:pPr>
+              <w:ind w:left="90" w:hanging="90"/>
+              <w:jc w:val="center"/>
+              <w:rPr>
+                <w:rFonts w:ascii="Century" w:hAnsi="Century"/>
+                <w:sz w:val="21"/>
+                <w:szCs w:val="21"/>
+              </w:rPr>
+            </w:pPr>
+            <w:r>
+              <w:rPr>
+                <w:rFonts w:ascii="Century" w:hAnsi="Century"/>
+                <w:sz w:val="21"/>
+                <w:szCs w:val="21"/>
+              </w:rPr>
               <w:t>Kirov-Class</w:t>
             </w:r>
           </w:p>
@@ -2061,14 +3462,28 @@
         <w:tc>
           <w:tcPr>
             <w:tcW w:w="900" w:type="dxa"/>
-            <w:vAlign w:val="center"/>
-          </w:tcPr>
-          <w:p>
-            <w:pPr>
-              <w:ind w:left="90" w:hanging="90"/>
-              <w:jc w:val="center"/>
-            </w:pPr>
-            <w:r>
+            <w:tcBorders>
+              <w:left w:val="single" w:sz="4" w:space="0" w:color="auto"/>
+              <w:right w:val="single" w:sz="4" w:space="0" w:color="auto"/>
+            </w:tcBorders>
+            <w:vAlign w:val="center"/>
+          </w:tcPr>
+          <w:p>
+            <w:pPr>
+              <w:ind w:left="90" w:hanging="90"/>
+              <w:jc w:val="center"/>
+              <w:rPr>
+                <w:rFonts w:ascii="Century" w:hAnsi="Century"/>
+                <w:sz w:val="21"/>
+                <w:szCs w:val="21"/>
+              </w:rPr>
+            </w:pPr>
+            <w:r>
+              <w:rPr>
+                <w:rFonts w:ascii="Century" w:hAnsi="Century"/>
+                <w:sz w:val="21"/>
+                <w:szCs w:val="21"/>
+              </w:rPr>
               <w:t>32m</w:t>
             </w:r>
           </w:p>
@@ -2076,14 +3491,28 @@
         <w:tc>
           <w:tcPr>
             <w:tcW w:w="990" w:type="dxa"/>
-            <w:vAlign w:val="center"/>
-          </w:tcPr>
-          <w:p>
-            <w:pPr>
-              <w:ind w:left="90" w:hanging="90"/>
-              <w:jc w:val="center"/>
-            </w:pPr>
-            <w:r>
+            <w:tcBorders>
+              <w:left w:val="single" w:sz="4" w:space="0" w:color="auto"/>
+              <w:right w:val="single" w:sz="4" w:space="0" w:color="auto"/>
+            </w:tcBorders>
+            <w:vAlign w:val="center"/>
+          </w:tcPr>
+          <w:p>
+            <w:pPr>
+              <w:ind w:left="90" w:hanging="90"/>
+              <w:jc w:val="center"/>
+              <w:rPr>
+                <w:rFonts w:ascii="Century" w:hAnsi="Century"/>
+                <w:sz w:val="21"/>
+                <w:szCs w:val="21"/>
+              </w:rPr>
+            </w:pPr>
+            <w:r>
+              <w:rPr>
+                <w:rFonts w:ascii="Century" w:hAnsi="Century"/>
+                <w:sz w:val="21"/>
+                <w:szCs w:val="21"/>
+              </w:rPr>
               <w:t>191m</w:t>
             </w:r>
           </w:p>
@@ -2091,14 +3520,27 @@
         <w:tc>
           <w:tcPr>
             <w:tcW w:w="1080" w:type="dxa"/>
-            <w:vAlign w:val="center"/>
-          </w:tcPr>
-          <w:p>
-            <w:pPr>
-              <w:ind w:left="90" w:hanging="90"/>
-              <w:jc w:val="center"/>
-            </w:pPr>
-            <w:r>
+            <w:tcBorders>
+              <w:left w:val="single" w:sz="4" w:space="0" w:color="auto"/>
+            </w:tcBorders>
+            <w:vAlign w:val="center"/>
+          </w:tcPr>
+          <w:p>
+            <w:pPr>
+              <w:ind w:left="90" w:hanging="90"/>
+              <w:jc w:val="center"/>
+              <w:rPr>
+                <w:rFonts w:ascii="Century" w:hAnsi="Century"/>
+                <w:sz w:val="21"/>
+                <w:szCs w:val="21"/>
+              </w:rPr>
+            </w:pPr>
+            <w:r>
+              <w:rPr>
+                <w:rFonts w:ascii="Century" w:hAnsi="Century"/>
+                <w:sz w:val="21"/>
+                <w:szCs w:val="21"/>
+              </w:rPr>
               <w:t>6.1m</w:t>
             </w:r>
           </w:p>
@@ -2106,19 +3548,32 @@
       </w:tr>
       <w:tr>
         <w:trPr>
-          <w:trHeight w:val="360"/>
+          <w:trHeight w:val="403"/>
         </w:trPr>
         <w:tc>
           <w:tcPr>
             <w:tcW w:w="1885" w:type="dxa"/>
-            <w:vAlign w:val="center"/>
-          </w:tcPr>
-          <w:p>
-            <w:pPr>
-              <w:ind w:left="90" w:hanging="90"/>
-              <w:jc w:val="center"/>
-            </w:pPr>
-            <w:r>
+            <w:tcBorders>
+              <w:right w:val="single" w:sz="4" w:space="0" w:color="auto"/>
+            </w:tcBorders>
+            <w:vAlign w:val="center"/>
+          </w:tcPr>
+          <w:p>
+            <w:pPr>
+              <w:ind w:left="90" w:hanging="90"/>
+              <w:jc w:val="center"/>
+              <w:rPr>
+                <w:rFonts w:ascii="Century" w:hAnsi="Century"/>
+                <w:sz w:val="21"/>
+                <w:szCs w:val="21"/>
+              </w:rPr>
+            </w:pPr>
+            <w:r>
+              <w:rPr>
+                <w:rFonts w:ascii="Century" w:hAnsi="Century"/>
+                <w:sz w:val="21"/>
+                <w:szCs w:val="21"/>
+              </w:rPr>
               <w:t>County-Class</w:t>
             </w:r>
           </w:p>
@@ -2126,14 +3581,28 @@
         <w:tc>
           <w:tcPr>
             <w:tcW w:w="900" w:type="dxa"/>
-            <w:vAlign w:val="center"/>
-          </w:tcPr>
-          <w:p>
-            <w:pPr>
-              <w:ind w:left="90" w:hanging="90"/>
-              <w:jc w:val="center"/>
-            </w:pPr>
-            <w:r>
+            <w:tcBorders>
+              <w:left w:val="single" w:sz="4" w:space="0" w:color="auto"/>
+              <w:right w:val="single" w:sz="4" w:space="0" w:color="auto"/>
+            </w:tcBorders>
+            <w:vAlign w:val="center"/>
+          </w:tcPr>
+          <w:p>
+            <w:pPr>
+              <w:ind w:left="90" w:hanging="90"/>
+              <w:jc w:val="center"/>
+              <w:rPr>
+                <w:rFonts w:ascii="Century" w:hAnsi="Century"/>
+                <w:sz w:val="21"/>
+                <w:szCs w:val="21"/>
+              </w:rPr>
+            </w:pPr>
+            <w:r>
+              <w:rPr>
+                <w:rFonts w:ascii="Century" w:hAnsi="Century"/>
+                <w:sz w:val="21"/>
+                <w:szCs w:val="21"/>
+              </w:rPr>
               <w:t>49m</w:t>
             </w:r>
           </w:p>
@@ -2141,14 +3610,28 @@
         <w:tc>
           <w:tcPr>
             <w:tcW w:w="990" w:type="dxa"/>
-            <w:vAlign w:val="center"/>
-          </w:tcPr>
-          <w:p>
-            <w:pPr>
-              <w:ind w:left="90" w:hanging="90"/>
-              <w:jc w:val="center"/>
-            </w:pPr>
-            <w:r>
+            <w:tcBorders>
+              <w:left w:val="single" w:sz="4" w:space="0" w:color="auto"/>
+              <w:right w:val="single" w:sz="4" w:space="0" w:color="auto"/>
+            </w:tcBorders>
+            <w:vAlign w:val="center"/>
+          </w:tcPr>
+          <w:p>
+            <w:pPr>
+              <w:ind w:left="90" w:hanging="90"/>
+              <w:jc w:val="center"/>
+              <w:rPr>
+                <w:rFonts w:ascii="Century" w:hAnsi="Century"/>
+                <w:sz w:val="21"/>
+                <w:szCs w:val="21"/>
+              </w:rPr>
+            </w:pPr>
+            <w:r>
+              <w:rPr>
+                <w:rFonts w:ascii="Century" w:hAnsi="Century"/>
+                <w:sz w:val="21"/>
+                <w:szCs w:val="21"/>
+              </w:rPr>
               <w:t>181m</w:t>
             </w:r>
           </w:p>
@@ -2156,14 +3639,27 @@
         <w:tc>
           <w:tcPr>
             <w:tcW w:w="1080" w:type="dxa"/>
-            <w:vAlign w:val="center"/>
-          </w:tcPr>
-          <w:p>
-            <w:pPr>
-              <w:ind w:left="90" w:hanging="90"/>
-              <w:jc w:val="center"/>
-            </w:pPr>
-            <w:r>
+            <w:tcBorders>
+              <w:left w:val="single" w:sz="4" w:space="0" w:color="auto"/>
+            </w:tcBorders>
+            <w:vAlign w:val="center"/>
+          </w:tcPr>
+          <w:p>
+            <w:pPr>
+              <w:ind w:left="90" w:hanging="90"/>
+              <w:jc w:val="center"/>
+              <w:rPr>
+                <w:rFonts w:ascii="Century" w:hAnsi="Century"/>
+                <w:sz w:val="21"/>
+                <w:szCs w:val="21"/>
+              </w:rPr>
+            </w:pPr>
+            <w:r>
+              <w:rPr>
+                <w:rFonts w:ascii="Century" w:hAnsi="Century"/>
+                <w:sz w:val="21"/>
+                <w:szCs w:val="21"/>
+              </w:rPr>
               <w:t>5.2m</w:t>
             </w:r>
           </w:p>
@@ -2171,19 +3667,32 @@
       </w:tr>
       <w:tr>
         <w:trPr>
-          <w:trHeight w:val="360"/>
+          <w:trHeight w:val="403"/>
         </w:trPr>
         <w:tc>
           <w:tcPr>
             <w:tcW w:w="1885" w:type="dxa"/>
-            <w:vAlign w:val="center"/>
-          </w:tcPr>
-          <w:p>
-            <w:pPr>
-              <w:ind w:left="90" w:hanging="90"/>
-              <w:jc w:val="center"/>
-            </w:pPr>
-            <w:r>
+            <w:tcBorders>
+              <w:right w:val="single" w:sz="4" w:space="0" w:color="auto"/>
+            </w:tcBorders>
+            <w:vAlign w:val="center"/>
+          </w:tcPr>
+          <w:p>
+            <w:pPr>
+              <w:ind w:left="90" w:hanging="90"/>
+              <w:jc w:val="center"/>
+              <w:rPr>
+                <w:rFonts w:ascii="Century" w:hAnsi="Century"/>
+                <w:sz w:val="21"/>
+                <w:szCs w:val="21"/>
+              </w:rPr>
+            </w:pPr>
+            <w:r>
+              <w:rPr>
+                <w:rFonts w:ascii="Century" w:hAnsi="Century"/>
+                <w:sz w:val="21"/>
+                <w:szCs w:val="21"/>
+              </w:rPr>
               <w:t>Illustrious-Class</w:t>
             </w:r>
           </w:p>
@@ -2191,14 +3700,28 @@
         <w:tc>
           <w:tcPr>
             <w:tcW w:w="900" w:type="dxa"/>
-            <w:vAlign w:val="center"/>
-          </w:tcPr>
-          <w:p>
-            <w:pPr>
-              <w:ind w:left="90" w:hanging="90"/>
-              <w:jc w:val="center"/>
-            </w:pPr>
-            <w:r>
+            <w:tcBorders>
+              <w:left w:val="single" w:sz="4" w:space="0" w:color="auto"/>
+              <w:right w:val="single" w:sz="4" w:space="0" w:color="auto"/>
+            </w:tcBorders>
+            <w:vAlign w:val="center"/>
+          </w:tcPr>
+          <w:p>
+            <w:pPr>
+              <w:ind w:left="90" w:hanging="90"/>
+              <w:jc w:val="center"/>
+              <w:rPr>
+                <w:rFonts w:ascii="Century" w:hAnsi="Century"/>
+                <w:sz w:val="21"/>
+                <w:szCs w:val="21"/>
+              </w:rPr>
+            </w:pPr>
+            <w:r>
+              <w:rPr>
+                <w:rFonts w:ascii="Century" w:hAnsi="Century"/>
+                <w:sz w:val="21"/>
+                <w:szCs w:val="21"/>
+              </w:rPr>
               <w:t>40m</w:t>
             </w:r>
           </w:p>
@@ -2206,14 +3729,28 @@
         <w:tc>
           <w:tcPr>
             <w:tcW w:w="990" w:type="dxa"/>
-            <w:vAlign w:val="center"/>
-          </w:tcPr>
-          <w:p>
-            <w:pPr>
-              <w:ind w:left="90" w:hanging="90"/>
-              <w:jc w:val="center"/>
-            </w:pPr>
-            <w:r>
+            <w:tcBorders>
+              <w:left w:val="single" w:sz="4" w:space="0" w:color="auto"/>
+              <w:right w:val="single" w:sz="4" w:space="0" w:color="auto"/>
+            </w:tcBorders>
+            <w:vAlign w:val="center"/>
+          </w:tcPr>
+          <w:p>
+            <w:pPr>
+              <w:ind w:left="90" w:hanging="90"/>
+              <w:jc w:val="center"/>
+              <w:rPr>
+                <w:rFonts w:ascii="Century" w:hAnsi="Century"/>
+                <w:sz w:val="21"/>
+                <w:szCs w:val="21"/>
+              </w:rPr>
+            </w:pPr>
+            <w:r>
+              <w:rPr>
+                <w:rFonts w:ascii="Century" w:hAnsi="Century"/>
+                <w:sz w:val="21"/>
+                <w:szCs w:val="21"/>
+              </w:rPr>
               <w:t>216m</w:t>
             </w:r>
           </w:p>
@@ -2221,14 +3758,27 @@
         <w:tc>
           <w:tcPr>
             <w:tcW w:w="1080" w:type="dxa"/>
-            <w:vAlign w:val="center"/>
-          </w:tcPr>
-          <w:p>
-            <w:pPr>
-              <w:ind w:left="90" w:hanging="90"/>
-              <w:jc w:val="center"/>
-            </w:pPr>
-            <w:r>
+            <w:tcBorders>
+              <w:left w:val="single" w:sz="4" w:space="0" w:color="auto"/>
+            </w:tcBorders>
+            <w:vAlign w:val="center"/>
+          </w:tcPr>
+          <w:p>
+            <w:pPr>
+              <w:ind w:left="90" w:hanging="90"/>
+              <w:jc w:val="center"/>
+              <w:rPr>
+                <w:rFonts w:ascii="Century" w:hAnsi="Century"/>
+                <w:sz w:val="21"/>
+                <w:szCs w:val="21"/>
+              </w:rPr>
+            </w:pPr>
+            <w:r>
+              <w:rPr>
+                <w:rFonts w:ascii="Century" w:hAnsi="Century"/>
+                <w:sz w:val="21"/>
+                <w:szCs w:val="21"/>
+              </w:rPr>
               <w:t>8.8m</w:t>
             </w:r>
           </w:p>
@@ -2236,19 +3786,33 @@
       </w:tr>
       <w:tr>
         <w:trPr>
-          <w:trHeight w:val="360"/>
+          <w:trHeight w:val="403"/>
         </w:trPr>
         <w:tc>
           <w:tcPr>
             <w:tcW w:w="1885" w:type="dxa"/>
-            <w:vAlign w:val="center"/>
-          </w:tcPr>
-          <w:p>
-            <w:pPr>
-              <w:ind w:left="90" w:hanging="90"/>
-              <w:jc w:val="center"/>
-            </w:pPr>
-            <w:r>
+            <w:tcBorders>
+              <w:bottom w:val="single" w:sz="4" w:space="0" w:color="auto"/>
+              <w:right w:val="single" w:sz="4" w:space="0" w:color="auto"/>
+            </w:tcBorders>
+            <w:vAlign w:val="center"/>
+          </w:tcPr>
+          <w:p>
+            <w:pPr>
+              <w:ind w:left="90" w:hanging="90"/>
+              <w:jc w:val="center"/>
+              <w:rPr>
+                <w:rFonts w:ascii="Century" w:hAnsi="Century"/>
+                <w:sz w:val="21"/>
+                <w:szCs w:val="21"/>
+              </w:rPr>
+            </w:pPr>
+            <w:r>
+              <w:rPr>
+                <w:rFonts w:ascii="Century" w:hAnsi="Century"/>
+                <w:sz w:val="21"/>
+                <w:szCs w:val="21"/>
+              </w:rPr>
               <w:t>Nelson-Class</w:t>
             </w:r>
           </w:p>
@@ -2256,14 +3820,29 @@
         <w:tc>
           <w:tcPr>
             <w:tcW w:w="900" w:type="dxa"/>
-            <w:vAlign w:val="center"/>
-          </w:tcPr>
-          <w:p>
-            <w:pPr>
-              <w:ind w:left="90" w:hanging="90"/>
-              <w:jc w:val="center"/>
-            </w:pPr>
-            <w:r>
+            <w:tcBorders>
+              <w:left w:val="single" w:sz="4" w:space="0" w:color="auto"/>
+              <w:bottom w:val="single" w:sz="4" w:space="0" w:color="auto"/>
+              <w:right w:val="single" w:sz="4" w:space="0" w:color="auto"/>
+            </w:tcBorders>
+            <w:vAlign w:val="center"/>
+          </w:tcPr>
+          <w:p>
+            <w:pPr>
+              <w:ind w:left="90" w:hanging="90"/>
+              <w:jc w:val="center"/>
+              <w:rPr>
+                <w:rFonts w:ascii="Century" w:hAnsi="Century"/>
+                <w:sz w:val="21"/>
+                <w:szCs w:val="21"/>
+              </w:rPr>
+            </w:pPr>
+            <w:r>
+              <w:rPr>
+                <w:rFonts w:ascii="Century" w:hAnsi="Century"/>
+                <w:sz w:val="21"/>
+                <w:szCs w:val="21"/>
+              </w:rPr>
               <w:t>56m</w:t>
             </w:r>
           </w:p>
@@ -2271,14 +3850,29 @@
         <w:tc>
           <w:tcPr>
             <w:tcW w:w="990" w:type="dxa"/>
-            <w:vAlign w:val="center"/>
-          </w:tcPr>
-          <w:p>
-            <w:pPr>
-              <w:ind w:left="90" w:hanging="90"/>
-              <w:jc w:val="center"/>
-            </w:pPr>
-            <w:r>
+            <w:tcBorders>
+              <w:left w:val="single" w:sz="4" w:space="0" w:color="auto"/>
+              <w:bottom w:val="single" w:sz="4" w:space="0" w:color="auto"/>
+              <w:right w:val="single" w:sz="4" w:space="0" w:color="auto"/>
+            </w:tcBorders>
+            <w:vAlign w:val="center"/>
+          </w:tcPr>
+          <w:p>
+            <w:pPr>
+              <w:ind w:left="90" w:hanging="90"/>
+              <w:jc w:val="center"/>
+              <w:rPr>
+                <w:rFonts w:ascii="Century" w:hAnsi="Century"/>
+                <w:sz w:val="21"/>
+                <w:szCs w:val="21"/>
+              </w:rPr>
+            </w:pPr>
+            <w:r>
+              <w:rPr>
+                <w:rFonts w:ascii="Century" w:hAnsi="Century"/>
+                <w:sz w:val="21"/>
+                <w:szCs w:val="21"/>
+              </w:rPr>
               <w:t>216m</w:t>
             </w:r>
           </w:p>
@@ -2286,14 +3880,28 @@
         <w:tc>
           <w:tcPr>
             <w:tcW w:w="1080" w:type="dxa"/>
-            <w:vAlign w:val="center"/>
-          </w:tcPr>
-          <w:p>
-            <w:pPr>
-              <w:ind w:left="90" w:hanging="90"/>
-              <w:jc w:val="center"/>
-            </w:pPr>
-            <w:r>
+            <w:tcBorders>
+              <w:left w:val="single" w:sz="4" w:space="0" w:color="auto"/>
+              <w:bottom w:val="single" w:sz="4" w:space="0" w:color="auto"/>
+            </w:tcBorders>
+            <w:vAlign w:val="center"/>
+          </w:tcPr>
+          <w:p>
+            <w:pPr>
+              <w:ind w:left="90" w:hanging="90"/>
+              <w:jc w:val="center"/>
+              <w:rPr>
+                <w:rFonts w:ascii="Century" w:hAnsi="Century"/>
+                <w:sz w:val="21"/>
+                <w:szCs w:val="21"/>
+              </w:rPr>
+            </w:pPr>
+            <w:r>
+              <w:rPr>
+                <w:rFonts w:ascii="Century" w:hAnsi="Century"/>
+                <w:sz w:val="21"/>
+                <w:szCs w:val="21"/>
+              </w:rPr>
               <w:t>9m</w:t>
             </w:r>
           </w:p>
@@ -2302,20 +3910,93 @@
     </w:tbl>
     <w:p/>
     <w:p>
+      <w:pPr>
+        <w:rPr>
+          <w:rFonts w:ascii="Century" w:hAnsi="Century"/>
+          <w:sz w:val="21"/>
+          <w:szCs w:val="21"/>
+        </w:rPr>
+      </w:pPr>
       <w:r>
+        <w:rPr>
+          <w:rFonts w:ascii="Century" w:hAnsi="Century"/>
+          <w:sz w:val="21"/>
+          <w:szCs w:val="21"/>
+        </w:rPr>
         <w:t>1 km/h = 0.5</w:t>
       </w:r>
       <w:r>
+        <w:rPr>
+          <w:rFonts w:ascii="Century" w:hAnsi="Century"/>
+          <w:sz w:val="21"/>
+          <w:szCs w:val="21"/>
+        </w:rPr>
         <w:t>4</w:t>
       </w:r>
       <w:r>
+        <w:rPr>
+          <w:rFonts w:ascii="Century" w:hAnsi="Century"/>
+          <w:sz w:val="21"/>
+          <w:szCs w:val="21"/>
+        </w:rPr>
         <w:t xml:space="preserve"> knots</w:t>
       </w:r>
       <w:r>
-        <w:t xml:space="preserve">. </w:t>
+        <w:rPr>
+          <w:rFonts w:ascii="Century" w:hAnsi="Century"/>
+          <w:sz w:val="21"/>
+          <w:szCs w:val="21"/>
+        </w:rPr>
+        <w:t xml:space="preserve"> </w:t>
       </w:r>
       <w:r>
-        <w:t xml:space="preserve">  1 knot = 1.852 km/h</w:t>
+        <w:rPr>
+          <w:rFonts w:ascii="Century" w:hAnsi="Century"/>
+          <w:sz w:val="21"/>
+          <w:szCs w:val="21"/>
+        </w:rPr>
+        <w:t xml:space="preserve"> </w:t>
+      </w:r>
+      <w:r>
+        <w:rPr>
+          <w:rFonts w:ascii="Century" w:hAnsi="Century"/>
+          <w:sz w:val="21"/>
+          <w:szCs w:val="21"/>
+        </w:rPr>
+        <w:t xml:space="preserve">  </w:t>
+      </w:r>
+      <w:r>
+        <w:rPr>
+          <w:rFonts w:ascii="Century" w:hAnsi="Century"/>
+          <w:sz w:val="21"/>
+          <w:szCs w:val="21"/>
+        </w:rPr>
+        <w:t xml:space="preserve">     </w:t>
+      </w:r>
+      <w:r>
+        <w:rPr>
+          <w:rFonts w:ascii="Century" w:hAnsi="Century"/>
+          <w:sz w:val="21"/>
+          <w:szCs w:val="21"/>
+        </w:rPr>
+        <w:t>1 knot = 1.852 km/h</w:t>
+      </w:r>
+    </w:p>
+    <w:p>
+      <w:pPr>
+        <w:rPr>
+          <w:rFonts w:ascii="Century" w:hAnsi="Century"/>
+          <w:sz w:val="21"/>
+          <w:szCs w:val="21"/>
+        </w:rPr>
+      </w:pPr>
+      <w:r>
+        <w:rPr>
+          <w:rFonts w:ascii="Century" w:hAnsi="Century"/>
+          <w:sz w:val="21"/>
+          <w:szCs w:val="21"/>
+        </w:rPr>
+        <w:t>Length (m) / Time (s) x 1.94 = speed (kts)</w:t>
       </w:r>
     </w:p>
     <w:p/>

</xml_diff>